<commit_message>
docs: replace pve02 references with generic Proxmox/cluster ecole
Pre-validation faite sur homelab perso (pve02), camarades sur cluster ecole.
Documentation generalisee pour etre reproductible sur les deux environnements.

Co-Authored-By: Claude Opus 4.6 <noreply@anthropic.com>
</commit_message>
<xml_diff>
--- a/docs/04-livrables/Architecture_Technique.docx
+++ b/docs/04-livrables/Architecture_Technique.docx
@@ -89,8 +89,36 @@
           <w:sz w:val="28"/>
           <w:szCs w:val="28"/>
         </w:rPr>
-        <w:t>MSPR – NordTransit Logistics</w:t>
+        <w:t xml:space="preserve">MSPR – </w:t>
       </w:r>
+      <w:proofErr w:type="spellStart"/>
+      <w:r>
+        <w:rPr>
+          <w:color w:val="555555"/>
+          <w:sz w:val="28"/>
+          <w:szCs w:val="28"/>
+        </w:rPr>
+        <w:t>NordTransit</w:t>
+      </w:r>
+      <w:proofErr w:type="spellEnd"/>
+      <w:r>
+        <w:rPr>
+          <w:color w:val="555555"/>
+          <w:sz w:val="28"/>
+          <w:szCs w:val="28"/>
+        </w:rPr>
+        <w:t xml:space="preserve"> </w:t>
+      </w:r>
+      <w:proofErr w:type="spellStart"/>
+      <w:r>
+        <w:rPr>
+          <w:color w:val="555555"/>
+          <w:sz w:val="28"/>
+          <w:szCs w:val="28"/>
+        </w:rPr>
+        <w:t>Logistics</w:t>
+      </w:r>
+      <w:proofErr w:type="spellEnd"/>
     </w:p>
     <w:p>
       <w:pPr>
@@ -201,8 +229,20 @@
           <w:sz w:val="24"/>
           <w:szCs w:val="24"/>
         </w:rPr>
-        <w:t>LANTSIGBLE Ojvind</w:t>
+        <w:t xml:space="preserve">LANTSIGBLE </w:t>
       </w:r>
+      <w:proofErr w:type="spellStart"/>
+      <w:r>
+        <w:rPr>
+          <w:b/>
+          <w:bCs/>
+          <w:color w:val="777777"/>
+          <w:sz w:val="24"/>
+          <w:szCs w:val="24"/>
+        </w:rPr>
+        <w:t>Ojvind</w:t>
+      </w:r>
+      <w:proofErr w:type="spellEnd"/>
     </w:p>
     <w:p>
       <w:pPr>
@@ -4393,8 +4433,21 @@
       <w:pPr>
         <w:spacing w:after="120"/>
       </w:pPr>
+      <w:proofErr w:type="spellStart"/>
       <w:r>
-        <w:t>NordTransit Logistics est une PME de logistique basée dans les Hauts-de-France. L’entreprise exploite 4 entrepôts permanents (Lille, Lens, Valenciennes, Arras) et 1 cross-dock saisonnier activé lors des pics e-commerce et des soldes.</w:t>
+        <w:t>NordTransit</w:t>
+      </w:r>
+      <w:proofErr w:type="spellEnd"/>
+      <w:r>
+        <w:t xml:space="preserve"> </w:t>
+      </w:r>
+      <w:proofErr w:type="spellStart"/>
+      <w:r>
+        <w:t>Logistics</w:t>
+      </w:r>
+      <w:proofErr w:type="spellEnd"/>
+      <w:r>
+        <w:t xml:space="preserve"> est une PME de logistique basée dans les Hauts-de-France. L’entreprise exploite 4 entrepôts permanents (Lille, Lens, Valenciennes, Arras) et 1 cross-dock saisonnier activé lors des pics e-commerce et des soldes.</w:t>
       </w:r>
     </w:p>
     <w:p>
@@ -4939,7 +4992,23 @@
                 <w:sz w:val="20"/>
                 <w:szCs w:val="20"/>
               </w:rPr>
-              <w:t>QoS VoIP, intégration VLAN</w:t>
+              <w:t xml:space="preserve">QoS </w:t>
+            </w:r>
+            <w:proofErr w:type="spellStart"/>
+            <w:r>
+              <w:rPr>
+                <w:sz w:val="20"/>
+                <w:szCs w:val="20"/>
+              </w:rPr>
+              <w:t>VoIP</w:t>
+            </w:r>
+            <w:proofErr w:type="spellEnd"/>
+            <w:r>
+              <w:rPr>
+                <w:sz w:val="20"/>
+                <w:szCs w:val="20"/>
+              </w:rPr>
+              <w:t>, intégration VLAN</w:t>
             </w:r>
           </w:p>
         </w:tc>
@@ -5455,12 +5524,21 @@
             </w:tcMar>
           </w:tcPr>
           <w:p>
-            <w:r>
-              <w:rPr>
-                <w:sz w:val="20"/>
-                <w:szCs w:val="20"/>
-              </w:rPr>
-              <w:t>VoIP (IPBX)</w:t>
+            <w:proofErr w:type="spellStart"/>
+            <w:r>
+              <w:rPr>
+                <w:sz w:val="20"/>
+                <w:szCs w:val="20"/>
+              </w:rPr>
+              <w:t>VoIP</w:t>
+            </w:r>
+            <w:proofErr w:type="spellEnd"/>
+            <w:r>
+              <w:rPr>
+                <w:sz w:val="20"/>
+                <w:szCs w:val="20"/>
+              </w:rPr>
+              <w:t xml:space="preserve"> (IPBX)</w:t>
             </w:r>
           </w:p>
         </w:tc>
@@ -5679,18 +5757,13 @@
         <w:t>Fenêtres de maintenance : nuit (après 18h30), samedi matin en haute saison.</w:t>
       </w:r>
     </w:p>
-    <w:p>
-      <w:r>
-        <w:br w:type="page"/>
-      </w:r>
-    </w:p>
+    <w:p/>
     <w:p>
       <w:pPr>
         <w:pStyle w:val="Heading1"/>
       </w:pPr>
       <w:bookmarkStart w:id="5" w:name="_Toc222085212"/>
       <w:r>
-        <w:lastRenderedPageBreak/>
         <w:t>2. Architecture existante</w:t>
       </w:r>
       <w:bookmarkEnd w:id="5"/>
@@ -6031,12 +6104,21 @@
             </w:tcMar>
           </w:tcPr>
           <w:p>
-            <w:r>
-              <w:rPr>
-                <w:sz w:val="20"/>
-                <w:szCs w:val="20"/>
-              </w:rPr>
-              <w:t>VMs hébergées</w:t>
+            <w:proofErr w:type="spellStart"/>
+            <w:r>
+              <w:rPr>
+                <w:sz w:val="20"/>
+                <w:szCs w:val="20"/>
+              </w:rPr>
+              <w:t>VMs</w:t>
+            </w:r>
+            <w:proofErr w:type="spellEnd"/>
+            <w:r>
+              <w:rPr>
+                <w:sz w:val="20"/>
+                <w:szCs w:val="20"/>
+              </w:rPr>
+              <w:t xml:space="preserve"> hébergées</w:t>
             </w:r>
           </w:p>
         </w:tc>
@@ -6198,7 +6280,31 @@
         <w:spacing w:after="120"/>
       </w:pPr>
       <w:r>
-        <w:t>L’infrastructure actuelle repose sur une architecture Hub &amp; Spoke centrée sur le siège de Lille. Le FortiGate 80D (en fin de vie) fait office de hub VPN, avec des DrayTek Vigor 2860 sur chaque entrepôt distant.</w:t>
+        <w:t xml:space="preserve">L’infrastructure actuelle repose sur une architecture Hub &amp; </w:t>
+      </w:r>
+      <w:proofErr w:type="spellStart"/>
+      <w:r>
+        <w:t>Spoke</w:t>
+      </w:r>
+      <w:proofErr w:type="spellEnd"/>
+      <w:r>
+        <w:t xml:space="preserve"> centrée sur le siège de Lille. Le </w:t>
+      </w:r>
+      <w:proofErr w:type="spellStart"/>
+      <w:r>
+        <w:t>FortiGate</w:t>
+      </w:r>
+      <w:proofErr w:type="spellEnd"/>
+      <w:r>
+        <w:t xml:space="preserve"> 80D (en fin de vie) fait office de hub VPN, avec des </w:t>
+      </w:r>
+      <w:proofErr w:type="spellStart"/>
+      <w:r>
+        <w:t>DrayTek</w:t>
+      </w:r>
+      <w:proofErr w:type="spellEnd"/>
+      <w:r>
+        <w:t xml:space="preserve"> Vigor 2860 sur chaque entrepôt distant.</w:t>
       </w:r>
     </w:p>
     <w:p>
@@ -6639,12 +6745,21 @@
             </w:tcMar>
           </w:tcPr>
           <w:p>
-            <w:r>
-              <w:rPr>
-                <w:sz w:val="20"/>
-                <w:szCs w:val="20"/>
-              </w:rPr>
-              <w:t>FortiGate 80D</w:t>
+            <w:proofErr w:type="spellStart"/>
+            <w:r>
+              <w:rPr>
+                <w:sz w:val="20"/>
+                <w:szCs w:val="20"/>
+              </w:rPr>
+              <w:t>FortiGate</w:t>
+            </w:r>
+            <w:proofErr w:type="spellEnd"/>
+            <w:r>
+              <w:rPr>
+                <w:sz w:val="20"/>
+                <w:szCs w:val="20"/>
+              </w:rPr>
+              <w:t xml:space="preserve"> 80D</w:t>
             </w:r>
           </w:p>
         </w:tc>
@@ -7578,6 +7693,7 @@
                 <w:sz w:val="20"/>
                 <w:szCs w:val="20"/>
               </w:rPr>
+              <w:lastRenderedPageBreak/>
               <w:t>IPBX-VM</w:t>
             </w:r>
           </w:p>
@@ -7836,7 +7952,6 @@
       </w:pPr>
       <w:bookmarkStart w:id="10" w:name="_Toc222085217"/>
       <w:r>
-        <w:lastRenderedPageBreak/>
         <w:t>Entrepôts distants</w:t>
       </w:r>
       <w:bookmarkEnd w:id="10"/>
@@ -8095,12 +8210,21 @@
             </w:tcMar>
           </w:tcPr>
           <w:p>
-            <w:r>
-              <w:rPr>
-                <w:sz w:val="20"/>
-                <w:szCs w:val="20"/>
-              </w:rPr>
-              <w:t>DrayTek Vigor 2860</w:t>
+            <w:proofErr w:type="spellStart"/>
+            <w:r>
+              <w:rPr>
+                <w:sz w:val="20"/>
+                <w:szCs w:val="20"/>
+              </w:rPr>
+              <w:t>DrayTek</w:t>
+            </w:r>
+            <w:proofErr w:type="spellEnd"/>
+            <w:r>
+              <w:rPr>
+                <w:sz w:val="20"/>
+                <w:szCs w:val="20"/>
+              </w:rPr>
+              <w:t xml:space="preserve"> Vigor 2860</w:t>
             </w:r>
           </w:p>
         </w:tc>
@@ -8230,12 +8354,21 @@
             </w:tcMar>
           </w:tcPr>
           <w:p>
-            <w:r>
-              <w:rPr>
-                <w:sz w:val="20"/>
-                <w:szCs w:val="20"/>
-              </w:rPr>
-              <w:t>DrayTek Vigor 2860</w:t>
+            <w:proofErr w:type="spellStart"/>
+            <w:r>
+              <w:rPr>
+                <w:sz w:val="20"/>
+                <w:szCs w:val="20"/>
+              </w:rPr>
+              <w:t>DrayTek</w:t>
+            </w:r>
+            <w:proofErr w:type="spellEnd"/>
+            <w:r>
+              <w:rPr>
+                <w:sz w:val="20"/>
+                <w:szCs w:val="20"/>
+              </w:rPr>
+              <w:t xml:space="preserve"> Vigor 2860</w:t>
             </w:r>
           </w:p>
         </w:tc>
@@ -8364,12 +8497,21 @@
             </w:tcMar>
           </w:tcPr>
           <w:p>
-            <w:r>
-              <w:rPr>
-                <w:sz w:val="20"/>
-                <w:szCs w:val="20"/>
-              </w:rPr>
-              <w:t>DrayTek Vigor 2860</w:t>
+            <w:proofErr w:type="spellStart"/>
+            <w:r>
+              <w:rPr>
+                <w:sz w:val="20"/>
+                <w:szCs w:val="20"/>
+              </w:rPr>
+              <w:t>DrayTek</w:t>
+            </w:r>
+            <w:proofErr w:type="spellEnd"/>
+            <w:r>
+              <w:rPr>
+                <w:sz w:val="20"/>
+                <w:szCs w:val="20"/>
+              </w:rPr>
+              <w:t xml:space="preserve"> Vigor 2860</w:t>
             </w:r>
           </w:p>
         </w:tc>
@@ -8990,13 +9132,31 @@
             </w:tcMar>
           </w:tcPr>
           <w:p>
-            <w:r>
-              <w:rPr>
-                <w:sz w:val="20"/>
-                <w:szCs w:val="20"/>
-              </w:rPr>
-              <w:t>DrayTek IPsec</w:t>
-            </w:r>
+            <w:proofErr w:type="spellStart"/>
+            <w:r>
+              <w:rPr>
+                <w:sz w:val="20"/>
+                <w:szCs w:val="20"/>
+              </w:rPr>
+              <w:t>DrayTek</w:t>
+            </w:r>
+            <w:proofErr w:type="spellEnd"/>
+            <w:r>
+              <w:rPr>
+                <w:sz w:val="20"/>
+                <w:szCs w:val="20"/>
+              </w:rPr>
+              <w:t xml:space="preserve"> </w:t>
+            </w:r>
+            <w:proofErr w:type="spellStart"/>
+            <w:r>
+              <w:rPr>
+                <w:sz w:val="20"/>
+                <w:szCs w:val="20"/>
+              </w:rPr>
+              <w:t>IPsec</w:t>
+            </w:r>
+            <w:proofErr w:type="spellEnd"/>
           </w:p>
         </w:tc>
         <w:tc>
@@ -9126,13 +9286,31 @@
             </w:tcMar>
           </w:tcPr>
           <w:p>
-            <w:r>
-              <w:rPr>
-                <w:sz w:val="20"/>
-                <w:szCs w:val="20"/>
-              </w:rPr>
-              <w:t>DrayTek IPsec</w:t>
-            </w:r>
+            <w:proofErr w:type="spellStart"/>
+            <w:r>
+              <w:rPr>
+                <w:sz w:val="20"/>
+                <w:szCs w:val="20"/>
+              </w:rPr>
+              <w:t>DrayTek</w:t>
+            </w:r>
+            <w:proofErr w:type="spellEnd"/>
+            <w:r>
+              <w:rPr>
+                <w:sz w:val="20"/>
+                <w:szCs w:val="20"/>
+              </w:rPr>
+              <w:t xml:space="preserve"> </w:t>
+            </w:r>
+            <w:proofErr w:type="spellStart"/>
+            <w:r>
+              <w:rPr>
+                <w:sz w:val="20"/>
+                <w:szCs w:val="20"/>
+              </w:rPr>
+              <w:t>IPsec</w:t>
+            </w:r>
+            <w:proofErr w:type="spellEnd"/>
           </w:p>
         </w:tc>
         <w:tc>
@@ -9259,13 +9437,31 @@
             </w:tcMar>
           </w:tcPr>
           <w:p>
-            <w:r>
-              <w:rPr>
-                <w:sz w:val="20"/>
-                <w:szCs w:val="20"/>
-              </w:rPr>
-              <w:t>DrayTek IPsec</w:t>
-            </w:r>
+            <w:proofErr w:type="spellStart"/>
+            <w:r>
+              <w:rPr>
+                <w:sz w:val="20"/>
+                <w:szCs w:val="20"/>
+              </w:rPr>
+              <w:t>DrayTek</w:t>
+            </w:r>
+            <w:proofErr w:type="spellEnd"/>
+            <w:r>
+              <w:rPr>
+                <w:sz w:val="20"/>
+                <w:szCs w:val="20"/>
+              </w:rPr>
+              <w:t xml:space="preserve"> </w:t>
+            </w:r>
+            <w:proofErr w:type="spellStart"/>
+            <w:r>
+              <w:rPr>
+                <w:sz w:val="20"/>
+                <w:szCs w:val="20"/>
+              </w:rPr>
+              <w:t>IPsec</w:t>
+            </w:r>
+            <w:proofErr w:type="spellEnd"/>
           </w:p>
         </w:tc>
         <w:tc>
@@ -10060,6 +10256,7 @@
         <w:rPr>
           <w:lang w:val="en-US"/>
         </w:rPr>
+        <w:lastRenderedPageBreak/>
         <w:t>SPOF (Single Points of Failure)</w:t>
       </w:r>
       <w:bookmarkEnd w:id="15"/>
@@ -10372,7 +10569,6 @@
                 <w:sz w:val="20"/>
                 <w:szCs w:val="20"/>
               </w:rPr>
-              <w:lastRenderedPageBreak/>
               <w:t>Pas de PRA</w:t>
             </w:r>
           </w:p>
@@ -10669,12 +10865,21 @@
             </w:tcMar>
           </w:tcPr>
           <w:p>
-            <w:r>
-              <w:rPr>
-                <w:sz w:val="20"/>
-                <w:szCs w:val="20"/>
-              </w:rPr>
-              <w:t>FortiGate 80D en EOL</w:t>
+            <w:proofErr w:type="spellStart"/>
+            <w:r>
+              <w:rPr>
+                <w:sz w:val="20"/>
+                <w:szCs w:val="20"/>
+              </w:rPr>
+              <w:t>FortiGate</w:t>
+            </w:r>
+            <w:proofErr w:type="spellEnd"/>
+            <w:r>
+              <w:rPr>
+                <w:sz w:val="20"/>
+                <w:szCs w:val="20"/>
+              </w:rPr>
+              <w:t xml:space="preserve"> 80D en EOL</w:t>
             </w:r>
           </w:p>
         </w:tc>
@@ -10750,12 +10955,21 @@
             </w:tcMar>
           </w:tcPr>
           <w:p>
-            <w:r>
-              <w:rPr>
-                <w:sz w:val="20"/>
-                <w:szCs w:val="20"/>
-              </w:rPr>
-              <w:t>DrayTek 2860</w:t>
+            <w:proofErr w:type="spellStart"/>
+            <w:r>
+              <w:rPr>
+                <w:sz w:val="20"/>
+                <w:szCs w:val="20"/>
+              </w:rPr>
+              <w:t>DrayTek</w:t>
+            </w:r>
+            <w:proofErr w:type="spellEnd"/>
+            <w:r>
+              <w:rPr>
+                <w:sz w:val="20"/>
+                <w:szCs w:val="20"/>
+              </w:rPr>
+              <w:t xml:space="preserve"> 2860</w:t>
             </w:r>
           </w:p>
         </w:tc>
@@ -10945,7 +11159,23 @@
                 <w:sz w:val="20"/>
                 <w:szCs w:val="20"/>
               </w:rPr>
-              <w:t>Configuration DrayTek basique, IKEv1</w:t>
+              <w:t xml:space="preserve">Configuration </w:t>
+            </w:r>
+            <w:proofErr w:type="spellStart"/>
+            <w:r>
+              <w:rPr>
+                <w:sz w:val="20"/>
+                <w:szCs w:val="20"/>
+              </w:rPr>
+              <w:t>DrayTek</w:t>
+            </w:r>
+            <w:proofErr w:type="spellEnd"/>
+            <w:r>
+              <w:rPr>
+                <w:sz w:val="20"/>
+                <w:szCs w:val="20"/>
+              </w:rPr>
+              <w:t xml:space="preserve"> basique, IKEv1</w:t>
             </w:r>
           </w:p>
         </w:tc>
@@ -11125,12 +11355,21 @@
             </w:tcMar>
           </w:tcPr>
           <w:p>
-            <w:r>
-              <w:rPr>
-                <w:sz w:val="20"/>
-                <w:szCs w:val="20"/>
-              </w:rPr>
-              <w:t>VoIP dégradée sous charge réseau</w:t>
+            <w:proofErr w:type="spellStart"/>
+            <w:r>
+              <w:rPr>
+                <w:sz w:val="20"/>
+                <w:szCs w:val="20"/>
+              </w:rPr>
+              <w:t>VoIP</w:t>
+            </w:r>
+            <w:proofErr w:type="spellEnd"/>
+            <w:r>
+              <w:rPr>
+                <w:sz w:val="20"/>
+                <w:szCs w:val="20"/>
+              </w:rPr>
+              <w:t xml:space="preserve"> dégradée sous charge réseau</w:t>
             </w:r>
           </w:p>
         </w:tc>
@@ -11186,7 +11425,23 @@
                 <w:sz w:val="20"/>
                 <w:szCs w:val="20"/>
               </w:rPr>
-              <w:t>Broadcast storms, pas d’isolation</w:t>
+              <w:t xml:space="preserve">Broadcast </w:t>
+            </w:r>
+            <w:proofErr w:type="spellStart"/>
+            <w:r>
+              <w:rPr>
+                <w:sz w:val="20"/>
+                <w:szCs w:val="20"/>
+              </w:rPr>
+              <w:t>storms</w:t>
+            </w:r>
+            <w:proofErr w:type="spellEnd"/>
+            <w:r>
+              <w:rPr>
+                <w:sz w:val="20"/>
+                <w:szCs w:val="20"/>
+              </w:rPr>
+              <w:t>, pas d’isolation</w:t>
             </w:r>
           </w:p>
         </w:tc>
@@ -11594,12 +11849,21 @@
             </w:tcMar>
           </w:tcPr>
           <w:p>
-            <w:r>
-              <w:rPr>
-                <w:sz w:val="20"/>
-                <w:szCs w:val="20"/>
-              </w:rPr>
-              <w:t>FortiGate homogènes + VPN IKEv2</w:t>
+            <w:proofErr w:type="spellStart"/>
+            <w:r>
+              <w:rPr>
+                <w:sz w:val="20"/>
+                <w:szCs w:val="20"/>
+              </w:rPr>
+              <w:t>FortiGate</w:t>
+            </w:r>
+            <w:proofErr w:type="spellEnd"/>
+            <w:r>
+              <w:rPr>
+                <w:sz w:val="20"/>
+                <w:szCs w:val="20"/>
+              </w:rPr>
+              <w:t xml:space="preserve"> homogènes + VPN IKEv2</w:t>
             </w:r>
           </w:p>
         </w:tc>
@@ -11655,8 +11919,17 @@
                 <w:sz w:val="20"/>
                 <w:szCs w:val="20"/>
               </w:rPr>
-              <w:t>QoS VoIP</w:t>
-            </w:r>
+              <w:t xml:space="preserve">QoS </w:t>
+            </w:r>
+            <w:proofErr w:type="spellStart"/>
+            <w:r>
+              <w:rPr>
+                <w:sz w:val="20"/>
+                <w:szCs w:val="20"/>
+              </w:rPr>
+              <w:t>VoIP</w:t>
+            </w:r>
+            <w:proofErr w:type="spellEnd"/>
           </w:p>
         </w:tc>
         <w:tc>
@@ -11999,7 +12272,25 @@
                 <w:szCs w:val="20"/>
                 <w:lang w:val="en-US"/>
               </w:rPr>
-              <w:t>Cluster 2 nœuds + SAN + PRA Azure</w:t>
+              <w:t xml:space="preserve">Cluster 2 </w:t>
+            </w:r>
+            <w:proofErr w:type="spellStart"/>
+            <w:r>
+              <w:rPr>
+                <w:sz w:val="20"/>
+                <w:szCs w:val="20"/>
+                <w:lang w:val="en-US"/>
+              </w:rPr>
+              <w:t>nœuds</w:t>
+            </w:r>
+            <w:proofErr w:type="spellEnd"/>
+            <w:r>
+              <w:rPr>
+                <w:sz w:val="20"/>
+                <w:szCs w:val="20"/>
+                <w:lang w:val="en-US"/>
+              </w:rPr>
+              <w:t xml:space="preserve"> + SAN + PRA Azure</w:t>
             </w:r>
           </w:p>
         </w:tc>
@@ -12050,12 +12341,37 @@
             </w:tcMar>
           </w:tcPr>
           <w:p>
-            <w:r>
-              <w:rPr>
-                <w:sz w:val="20"/>
-                <w:szCs w:val="20"/>
-              </w:rPr>
-              <w:t>DrayTek obsolètes, FortiGate 80D EOL</w:t>
+            <w:proofErr w:type="spellStart"/>
+            <w:r>
+              <w:rPr>
+                <w:sz w:val="20"/>
+                <w:szCs w:val="20"/>
+              </w:rPr>
+              <w:t>DrayTek</w:t>
+            </w:r>
+            <w:proofErr w:type="spellEnd"/>
+            <w:r>
+              <w:rPr>
+                <w:sz w:val="20"/>
+                <w:szCs w:val="20"/>
+              </w:rPr>
+              <w:t xml:space="preserve"> obsolètes, </w:t>
+            </w:r>
+            <w:proofErr w:type="spellStart"/>
+            <w:r>
+              <w:rPr>
+                <w:sz w:val="20"/>
+                <w:szCs w:val="20"/>
+              </w:rPr>
+              <w:t>FortiGate</w:t>
+            </w:r>
+            <w:proofErr w:type="spellEnd"/>
+            <w:r>
+              <w:rPr>
+                <w:sz w:val="20"/>
+                <w:szCs w:val="20"/>
+              </w:rPr>
+              <w:t xml:space="preserve"> 80D EOL</w:t>
             </w:r>
           </w:p>
         </w:tc>
@@ -12077,12 +12393,21 @@
             </w:tcMar>
           </w:tcPr>
           <w:p>
-            <w:r>
-              <w:rPr>
-                <w:sz w:val="20"/>
-                <w:szCs w:val="20"/>
-              </w:rPr>
-              <w:t>FortiGate homogènes + IKEv2 AES-256</w:t>
+            <w:proofErr w:type="spellStart"/>
+            <w:r>
+              <w:rPr>
+                <w:sz w:val="20"/>
+                <w:szCs w:val="20"/>
+              </w:rPr>
+              <w:t>FortiGate</w:t>
+            </w:r>
+            <w:proofErr w:type="spellEnd"/>
+            <w:r>
+              <w:rPr>
+                <w:sz w:val="20"/>
+                <w:szCs w:val="20"/>
+              </w:rPr>
+              <w:t xml:space="preserve"> homogènes + IKEv2 AES-256</w:t>
             </w:r>
           </w:p>
         </w:tc>
@@ -12110,8 +12435,17 @@
                 <w:sz w:val="20"/>
                 <w:szCs w:val="20"/>
               </w:rPr>
-              <w:t>Garantir la VoIP</w:t>
-            </w:r>
+              <w:t xml:space="preserve">Garantir la </w:t>
+            </w:r>
+            <w:proofErr w:type="spellStart"/>
+            <w:r>
+              <w:rPr>
+                <w:sz w:val="20"/>
+                <w:szCs w:val="20"/>
+              </w:rPr>
+              <w:t>VoIP</w:t>
+            </w:r>
+            <w:proofErr w:type="spellEnd"/>
           </w:p>
         </w:tc>
         <w:tc>
@@ -12162,7 +12496,23 @@
                 <w:sz w:val="20"/>
                 <w:szCs w:val="20"/>
               </w:rPr>
-              <w:t>QoS DSCP sur FortiGate + VLAN dédié</w:t>
+              <w:t xml:space="preserve">QoS DSCP sur </w:t>
+            </w:r>
+            <w:proofErr w:type="spellStart"/>
+            <w:r>
+              <w:rPr>
+                <w:sz w:val="20"/>
+                <w:szCs w:val="20"/>
+              </w:rPr>
+              <w:t>FortiGate</w:t>
+            </w:r>
+            <w:proofErr w:type="spellEnd"/>
+            <w:r>
+              <w:rPr>
+                <w:sz w:val="20"/>
+                <w:szCs w:val="20"/>
+              </w:rPr>
+              <w:t xml:space="preserve"> + VLAN dédié</w:t>
             </w:r>
           </w:p>
         </w:tc>
@@ -12357,7 +12707,15 @@
         <w:spacing w:after="120"/>
       </w:pPr>
       <w:r>
-        <w:t>L’architecture cible repose sur une flotte homogène de pare-feu FortiGate, un cluster de serveurs haute disponibilité avec stockage SAN, et un PRA Azure complémentaire. Chaque site distant bénéficie d’un VPN IKEv2 AES-256 et d’un lien de secours 4G/5G.</w:t>
+        <w:t xml:space="preserve">L’architecture cible repose sur une flotte homogène de pare-feu </w:t>
+      </w:r>
+      <w:proofErr w:type="spellStart"/>
+      <w:r>
+        <w:t>FortiGate</w:t>
+      </w:r>
+      <w:proofErr w:type="spellEnd"/>
+      <w:r>
+        <w:t>, un cluster de serveurs haute disponibilité avec stockage SAN, et un PRA Azure complémentaire. Chaque site distant bénéficie d’un VPN IKEv2 AES-256 et d’un lien de secours 4G/5G.</w:t>
       </w:r>
     </w:p>
     <w:p>
@@ -12385,7 +12743,15 @@
         <w:spacing w:after="120"/>
       </w:pPr>
       <w:r>
-        <w:t>Le passage à une flotte 100% FortiGate permet une gestion centralisée, une politique de sécurité uniforme et une seule compétence à maintenir pour l’équipe DSI.</w:t>
+        <w:t xml:space="preserve">Le passage à une flotte 100% </w:t>
+      </w:r>
+      <w:proofErr w:type="spellStart"/>
+      <w:r>
+        <w:t>FortiGate</w:t>
+      </w:r>
+      <w:proofErr w:type="spellEnd"/>
+      <w:r>
+        <w:t xml:space="preserve"> permet une gestion centralisée, une politique de sécurité uniforme et une seule compétence à maintenir pour l’équipe DSI.</w:t>
       </w:r>
     </w:p>
     <w:tbl>
@@ -12584,12 +12950,21 @@
             </w:tcMar>
           </w:tcPr>
           <w:p>
-            <w:r>
-              <w:rPr>
-                <w:sz w:val="20"/>
-                <w:szCs w:val="20"/>
-              </w:rPr>
-              <w:t>FortiGate 80D (EOL)</w:t>
+            <w:proofErr w:type="spellStart"/>
+            <w:r>
+              <w:rPr>
+                <w:sz w:val="20"/>
+                <w:szCs w:val="20"/>
+              </w:rPr>
+              <w:t>FortiGate</w:t>
+            </w:r>
+            <w:proofErr w:type="spellEnd"/>
+            <w:r>
+              <w:rPr>
+                <w:sz w:val="20"/>
+                <w:szCs w:val="20"/>
+              </w:rPr>
+              <w:t xml:space="preserve"> 80D (EOL)</w:t>
             </w:r>
           </w:p>
         </w:tc>
@@ -12610,6 +12985,7 @@
             </w:tcMar>
           </w:tcPr>
           <w:p>
+            <w:proofErr w:type="spellStart"/>
             <w:r>
               <w:rPr>
                 <w:b/>
@@ -12617,7 +12993,17 @@
                 <w:sz w:val="20"/>
                 <w:szCs w:val="20"/>
               </w:rPr>
-              <w:t>FortiGate 100F</w:t>
+              <w:t>FortiGate</w:t>
+            </w:r>
+            <w:proofErr w:type="spellEnd"/>
+            <w:r>
+              <w:rPr>
+                <w:b/>
+                <w:bCs/>
+                <w:sz w:val="20"/>
+                <w:szCs w:val="20"/>
+              </w:rPr>
+              <w:t xml:space="preserve"> 100F</w:t>
             </w:r>
           </w:p>
         </w:tc>
@@ -12643,7 +13029,23 @@
                 <w:sz w:val="20"/>
                 <w:szCs w:val="20"/>
               </w:rPr>
-              <w:t>Hub VPN, débit 1 Gbps, UTM complet</w:t>
+              <w:t xml:space="preserve">Hub VPN, débit 1 </w:t>
+            </w:r>
+            <w:proofErr w:type="spellStart"/>
+            <w:r>
+              <w:rPr>
+                <w:sz w:val="20"/>
+                <w:szCs w:val="20"/>
+              </w:rPr>
+              <w:t>Gbps</w:t>
+            </w:r>
+            <w:proofErr w:type="spellEnd"/>
+            <w:r>
+              <w:rPr>
+                <w:sz w:val="20"/>
+                <w:szCs w:val="20"/>
+              </w:rPr>
+              <w:t>, UTM complet</w:t>
             </w:r>
           </w:p>
         </w:tc>
@@ -12694,12 +13096,21 @@
             </w:tcMar>
           </w:tcPr>
           <w:p>
-            <w:r>
-              <w:rPr>
-                <w:sz w:val="20"/>
-                <w:szCs w:val="20"/>
-              </w:rPr>
-              <w:t>DrayTek 2860</w:t>
+            <w:proofErr w:type="spellStart"/>
+            <w:r>
+              <w:rPr>
+                <w:sz w:val="20"/>
+                <w:szCs w:val="20"/>
+              </w:rPr>
+              <w:t>DrayTek</w:t>
+            </w:r>
+            <w:proofErr w:type="spellEnd"/>
+            <w:r>
+              <w:rPr>
+                <w:sz w:val="20"/>
+                <w:szCs w:val="20"/>
+              </w:rPr>
+              <w:t xml:space="preserve"> 2860</w:t>
             </w:r>
           </w:p>
         </w:tc>
@@ -12721,6 +13132,7 @@
             </w:tcMar>
           </w:tcPr>
           <w:p>
+            <w:proofErr w:type="spellStart"/>
             <w:r>
               <w:rPr>
                 <w:b/>
@@ -12728,7 +13140,17 @@
                 <w:sz w:val="20"/>
                 <w:szCs w:val="20"/>
               </w:rPr>
-              <w:t>FortiGate 60F</w:t>
+              <w:t>FortiGate</w:t>
+            </w:r>
+            <w:proofErr w:type="spellEnd"/>
+            <w:r>
+              <w:rPr>
+                <w:b/>
+                <w:bCs/>
+                <w:sz w:val="20"/>
+                <w:szCs w:val="20"/>
+              </w:rPr>
+              <w:t xml:space="preserve"> 60F</w:t>
             </w:r>
           </w:p>
         </w:tc>
@@ -12810,12 +13232,21 @@
             </w:tcMar>
           </w:tcPr>
           <w:p>
-            <w:r>
-              <w:rPr>
-                <w:sz w:val="20"/>
-                <w:szCs w:val="20"/>
-              </w:rPr>
-              <w:t>DrayTek 2860</w:t>
+            <w:proofErr w:type="spellStart"/>
+            <w:r>
+              <w:rPr>
+                <w:sz w:val="20"/>
+                <w:szCs w:val="20"/>
+              </w:rPr>
+              <w:t>DrayTek</w:t>
+            </w:r>
+            <w:proofErr w:type="spellEnd"/>
+            <w:r>
+              <w:rPr>
+                <w:sz w:val="20"/>
+                <w:szCs w:val="20"/>
+              </w:rPr>
+              <w:t xml:space="preserve"> 2860</w:t>
             </w:r>
           </w:p>
         </w:tc>
@@ -12836,6 +13267,7 @@
             </w:tcMar>
           </w:tcPr>
           <w:p>
+            <w:proofErr w:type="spellStart"/>
             <w:r>
               <w:rPr>
                 <w:b/>
@@ -12843,7 +13275,17 @@
                 <w:sz w:val="20"/>
                 <w:szCs w:val="20"/>
               </w:rPr>
-              <w:t>FortiGate 60F</w:t>
+              <w:t>FortiGate</w:t>
+            </w:r>
+            <w:proofErr w:type="spellEnd"/>
+            <w:r>
+              <w:rPr>
+                <w:b/>
+                <w:bCs/>
+                <w:sz w:val="20"/>
+                <w:szCs w:val="20"/>
+              </w:rPr>
+              <w:t xml:space="preserve"> 60F</w:t>
             </w:r>
           </w:p>
         </w:tc>
@@ -12926,12 +13368,21 @@
             </w:tcMar>
           </w:tcPr>
           <w:p>
-            <w:r>
-              <w:rPr>
-                <w:sz w:val="20"/>
-                <w:szCs w:val="20"/>
-              </w:rPr>
-              <w:t>DrayTek 2860</w:t>
+            <w:proofErr w:type="spellStart"/>
+            <w:r>
+              <w:rPr>
+                <w:sz w:val="20"/>
+                <w:szCs w:val="20"/>
+              </w:rPr>
+              <w:t>DrayTek</w:t>
+            </w:r>
+            <w:proofErr w:type="spellEnd"/>
+            <w:r>
+              <w:rPr>
+                <w:sz w:val="20"/>
+                <w:szCs w:val="20"/>
+              </w:rPr>
+              <w:t xml:space="preserve"> 2860</w:t>
             </w:r>
           </w:p>
         </w:tc>
@@ -12953,6 +13404,7 @@
             </w:tcMar>
           </w:tcPr>
           <w:p>
+            <w:proofErr w:type="spellStart"/>
             <w:r>
               <w:rPr>
                 <w:b/>
@@ -12960,7 +13412,17 @@
                 <w:sz w:val="20"/>
                 <w:szCs w:val="20"/>
               </w:rPr>
-              <w:t>FortiGate 60F</w:t>
+              <w:t>FortiGate</w:t>
+            </w:r>
+            <w:proofErr w:type="spellEnd"/>
+            <w:r>
+              <w:rPr>
+                <w:b/>
+                <w:bCs/>
+                <w:sz w:val="20"/>
+                <w:szCs w:val="20"/>
+              </w:rPr>
+              <w:t xml:space="preserve"> 60F</w:t>
             </w:r>
           </w:p>
         </w:tc>
@@ -13068,6 +13530,7 @@
             </w:tcMar>
           </w:tcPr>
           <w:p>
+            <w:proofErr w:type="spellStart"/>
             <w:r>
               <w:rPr>
                 <w:b/>
@@ -13075,7 +13538,17 @@
                 <w:sz w:val="20"/>
                 <w:szCs w:val="20"/>
               </w:rPr>
-              <w:t>FortiGate 40F</w:t>
+              <w:t>FortiGate</w:t>
+            </w:r>
+            <w:proofErr w:type="spellEnd"/>
+            <w:r>
+              <w:rPr>
+                <w:b/>
+                <w:bCs/>
+                <w:sz w:val="20"/>
+                <w:szCs w:val="20"/>
+              </w:rPr>
+              <w:t xml:space="preserve"> 40F</w:t>
             </w:r>
           </w:p>
         </w:tc>
@@ -13291,7 +13764,23 @@
                 <w:sz w:val="20"/>
                 <w:szCs w:val="20"/>
               </w:rPr>
-              <w:t>IKEv1 (DrayTek)</w:t>
+              <w:t>IKEv1 (</w:t>
+            </w:r>
+            <w:proofErr w:type="spellStart"/>
+            <w:r>
+              <w:rPr>
+                <w:sz w:val="20"/>
+                <w:szCs w:val="20"/>
+              </w:rPr>
+              <w:t>DrayTek</w:t>
+            </w:r>
+            <w:proofErr w:type="spellEnd"/>
+            <w:r>
+              <w:rPr>
+                <w:sz w:val="20"/>
+                <w:szCs w:val="20"/>
+              </w:rPr>
+              <w:t>)</w:t>
             </w:r>
           </w:p>
         </w:tc>
@@ -13487,7 +13976,27 @@
                 <w:sz w:val="20"/>
                 <w:szCs w:val="20"/>
               </w:rPr>
-              <w:t>PSK (lab) puis certificats (prod)</w:t>
+              <w:t>PSK (</w:t>
+            </w:r>
+            <w:proofErr w:type="spellStart"/>
+            <w:r>
+              <w:rPr>
+                <w:b/>
+                <w:bCs/>
+                <w:sz w:val="20"/>
+                <w:szCs w:val="20"/>
+              </w:rPr>
+              <w:t>lab</w:t>
+            </w:r>
+            <w:proofErr w:type="spellEnd"/>
+            <w:r>
+              <w:rPr>
+                <w:b/>
+                <w:bCs/>
+                <w:sz w:val="20"/>
+                <w:szCs w:val="20"/>
+              </w:rPr>
+              <w:t>) puis certificats (prod)</w:t>
             </w:r>
           </w:p>
         </w:tc>
@@ -13572,7 +14081,27 @@
                 <w:sz w:val="20"/>
                 <w:szCs w:val="20"/>
               </w:rPr>
-              <w:t>DPD (Dead Peer Detection)</w:t>
+              <w:t xml:space="preserve">DPD (Dead Peer </w:t>
+            </w:r>
+            <w:proofErr w:type="spellStart"/>
+            <w:r>
+              <w:rPr>
+                <w:b/>
+                <w:bCs/>
+                <w:sz w:val="20"/>
+                <w:szCs w:val="20"/>
+              </w:rPr>
+              <w:t>Detection</w:t>
+            </w:r>
+            <w:proofErr w:type="spellEnd"/>
+            <w:r>
+              <w:rPr>
+                <w:b/>
+                <w:bCs/>
+                <w:sz w:val="20"/>
+                <w:szCs w:val="20"/>
+              </w:rPr>
+              <w:t>)</w:t>
             </w:r>
           </w:p>
         </w:tc>
@@ -14581,12 +15110,21 @@
             </w:tcMar>
           </w:tcPr>
           <w:p>
-            <w:r>
-              <w:rPr>
-                <w:sz w:val="20"/>
-                <w:szCs w:val="20"/>
-              </w:rPr>
-              <w:t>FortiToken (TOTP)</w:t>
+            <w:proofErr w:type="spellStart"/>
+            <w:r>
+              <w:rPr>
+                <w:sz w:val="20"/>
+                <w:szCs w:val="20"/>
+              </w:rPr>
+              <w:t>FortiToken</w:t>
+            </w:r>
+            <w:proofErr w:type="spellEnd"/>
+            <w:r>
+              <w:rPr>
+                <w:sz w:val="20"/>
+                <w:szCs w:val="20"/>
+              </w:rPr>
+              <w:t xml:space="preserve"> (TOTP)</w:t>
             </w:r>
           </w:p>
         </w:tc>
@@ -14615,8 +15153,17 @@
                 <w:sz w:val="20"/>
                 <w:szCs w:val="20"/>
               </w:rPr>
-              <w:t>Admin FortiGate</w:t>
-            </w:r>
+              <w:t xml:space="preserve">Admin </w:t>
+            </w:r>
+            <w:proofErr w:type="spellStart"/>
+            <w:r>
+              <w:rPr>
+                <w:sz w:val="20"/>
+                <w:szCs w:val="20"/>
+              </w:rPr>
+              <w:t>FortiGate</w:t>
+            </w:r>
+            <w:proofErr w:type="spellEnd"/>
           </w:p>
         </w:tc>
         <w:tc>
@@ -14664,6 +15211,7 @@
             </w:tcMar>
           </w:tcPr>
           <w:p>
+            <w:proofErr w:type="spellStart"/>
             <w:r>
               <w:rPr>
                 <w:sz w:val="20"/>
@@ -14671,6 +15219,7 @@
               </w:rPr>
               <w:t>FortiToken</w:t>
             </w:r>
+            <w:proofErr w:type="spellEnd"/>
           </w:p>
         </w:tc>
       </w:tr>
@@ -14778,8 +15327,17 @@
                 <w:sz w:val="20"/>
                 <w:szCs w:val="20"/>
               </w:rPr>
-              <w:t>Console Proxmox</w:t>
-            </w:r>
+              <w:t xml:space="preserve">Console </w:t>
+            </w:r>
+            <w:proofErr w:type="spellStart"/>
+            <w:r>
+              <w:rPr>
+                <w:sz w:val="20"/>
+                <w:szCs w:val="20"/>
+              </w:rPr>
+              <w:t>Proxmox</w:t>
+            </w:r>
+            <w:proofErr w:type="spellEnd"/>
           </w:p>
         </w:tc>
         <w:tc>
@@ -15194,12 +15752,21 @@
             </w:tcMar>
           </w:tcPr>
           <w:p>
-            <w:r>
-              <w:rPr>
-                <w:sz w:val="20"/>
-                <w:szCs w:val="20"/>
-              </w:rPr>
-              <w:t>VMs, stockage SAN</w:t>
+            <w:proofErr w:type="spellStart"/>
+            <w:r>
+              <w:rPr>
+                <w:sz w:val="20"/>
+                <w:szCs w:val="20"/>
+              </w:rPr>
+              <w:t>VMs</w:t>
+            </w:r>
+            <w:proofErr w:type="spellEnd"/>
+            <w:r>
+              <w:rPr>
+                <w:sz w:val="20"/>
+                <w:szCs w:val="20"/>
+              </w:rPr>
+              <w:t>, stockage SAN</w:t>
             </w:r>
           </w:p>
         </w:tc>
@@ -17904,12 +18471,21 @@
             </w:tcMar>
           </w:tcPr>
           <w:p>
-            <w:r>
-              <w:rPr>
-                <w:sz w:val="20"/>
-                <w:szCs w:val="20"/>
-              </w:rPr>
-              <w:t>Compute + Quorum</w:t>
+            <w:proofErr w:type="spellStart"/>
+            <w:r>
+              <w:rPr>
+                <w:sz w:val="20"/>
+                <w:szCs w:val="20"/>
+              </w:rPr>
+              <w:t>Compute</w:t>
+            </w:r>
+            <w:proofErr w:type="spellEnd"/>
+            <w:r>
+              <w:rPr>
+                <w:sz w:val="20"/>
+                <w:szCs w:val="20"/>
+              </w:rPr>
+              <w:t xml:space="preserve"> + Quorum</w:t>
             </w:r>
           </w:p>
         </w:tc>
@@ -17987,12 +18563,21 @@
             </w:tcMar>
           </w:tcPr>
           <w:p>
-            <w:r>
-              <w:rPr>
-                <w:sz w:val="20"/>
-                <w:szCs w:val="20"/>
-              </w:rPr>
-              <w:t>Compute + Quorum</w:t>
+            <w:proofErr w:type="spellStart"/>
+            <w:r>
+              <w:rPr>
+                <w:sz w:val="20"/>
+                <w:szCs w:val="20"/>
+              </w:rPr>
+              <w:t>Compute</w:t>
+            </w:r>
+            <w:proofErr w:type="spellEnd"/>
+            <w:r>
+              <w:rPr>
+                <w:sz w:val="20"/>
+                <w:szCs w:val="20"/>
+              </w:rPr>
+              <w:t xml:space="preserve"> + Quorum</w:t>
             </w:r>
           </w:p>
         </w:tc>
@@ -18046,13 +18631,23 @@
                 <w:lang w:val="en-US"/>
               </w:rPr>
             </w:pPr>
+            <w:proofErr w:type="spellStart"/>
             <w:r>
               <w:rPr>
                 <w:sz w:val="20"/>
                 <w:szCs w:val="20"/>
                 <w:lang w:val="en-US"/>
               </w:rPr>
-              <w:t>PowerVault ME5012, 8x SSD 1.92 To</w:t>
+              <w:t>PowerVault</w:t>
+            </w:r>
+            <w:proofErr w:type="spellEnd"/>
+            <w:r>
+              <w:rPr>
+                <w:sz w:val="20"/>
+                <w:szCs w:val="20"/>
+                <w:lang w:val="en-US"/>
+              </w:rPr>
+              <w:t xml:space="preserve"> ME5012, 8x SSD 1.92 To</w:t>
             </w:r>
           </w:p>
         </w:tc>
@@ -18134,8 +18729,17 @@
                 <w:sz w:val="20"/>
                 <w:szCs w:val="20"/>
               </w:rPr>
-              <w:t>Azure Cloud Witness</w:t>
-            </w:r>
+              <w:t xml:space="preserve">Azure Cloud </w:t>
+            </w:r>
+            <w:proofErr w:type="spellStart"/>
+            <w:r>
+              <w:rPr>
+                <w:sz w:val="20"/>
+                <w:szCs w:val="20"/>
+              </w:rPr>
+              <w:t>Witness</w:t>
+            </w:r>
+            <w:proofErr w:type="spellEnd"/>
           </w:p>
         </w:tc>
         <w:tc>
@@ -18207,7 +18811,15 @@
         <w:spacing w:after="60"/>
       </w:pPr>
       <w:r>
-        <w:t>Azure Site Recovery assure le PRA géographique</w:t>
+        <w:t xml:space="preserve">Azure Site </w:t>
+      </w:r>
+      <w:proofErr w:type="spellStart"/>
+      <w:r>
+        <w:t>Recovery</w:t>
+      </w:r>
+      <w:proofErr w:type="spellEnd"/>
+      <w:r>
+        <w:t xml:space="preserve"> assure le PRA géographique</w:t>
       </w:r>
     </w:p>
     <w:p>
@@ -18233,8 +18845,13 @@
         <w:spacing w:after="60"/>
       </w:pPr>
       <w:r>
-        <w:t>3ème vote de quorum assuré par Azure Cloud Witness</w:t>
+        <w:t xml:space="preserve">3ème vote de quorum assuré par Azure Cloud </w:t>
       </w:r>
+      <w:proofErr w:type="spellStart"/>
+      <w:r>
+        <w:t>Witness</w:t>
+      </w:r>
+      <w:proofErr w:type="spellEnd"/>
     </w:p>
     <w:p>
       <w:pPr>
@@ -18384,7 +19001,23 @@
                 <w:sz w:val="20"/>
                 <w:szCs w:val="20"/>
               </w:rPr>
-              <w:t>Dell PowerVault ME5012</w:t>
+              <w:t xml:space="preserve">Dell </w:t>
+            </w:r>
+            <w:proofErr w:type="spellStart"/>
+            <w:r>
+              <w:rPr>
+                <w:sz w:val="20"/>
+                <w:szCs w:val="20"/>
+              </w:rPr>
+              <w:t>PowerVault</w:t>
+            </w:r>
+            <w:proofErr w:type="spellEnd"/>
+            <w:r>
+              <w:rPr>
+                <w:sz w:val="20"/>
+                <w:szCs w:val="20"/>
+              </w:rPr>
+              <w:t xml:space="preserve"> ME5012</w:t>
             </w:r>
           </w:p>
         </w:tc>
@@ -18856,8 +19489,17 @@
                 <w:sz w:val="20"/>
                 <w:szCs w:val="20"/>
               </w:rPr>
-              <w:t>Azure Site Recovery</w:t>
-            </w:r>
+              <w:t xml:space="preserve">Azure Site </w:t>
+            </w:r>
+            <w:proofErr w:type="spellStart"/>
+            <w:r>
+              <w:rPr>
+                <w:sz w:val="20"/>
+                <w:szCs w:val="20"/>
+              </w:rPr>
+              <w:t>Recovery</w:t>
+            </w:r>
+            <w:proofErr w:type="spellEnd"/>
           </w:p>
         </w:tc>
         <w:tc>
@@ -18882,7 +19524,23 @@
                 <w:sz w:val="20"/>
                 <w:szCs w:val="20"/>
               </w:rPr>
-              <w:t>Réplication 20 VMs, failover automatisé</w:t>
+              <w:t xml:space="preserve">Réplication 20 </w:t>
+            </w:r>
+            <w:proofErr w:type="spellStart"/>
+            <w:r>
+              <w:rPr>
+                <w:sz w:val="20"/>
+                <w:szCs w:val="20"/>
+              </w:rPr>
+              <w:t>VMs</w:t>
+            </w:r>
+            <w:proofErr w:type="spellEnd"/>
+            <w:r>
+              <w:rPr>
+                <w:sz w:val="20"/>
+                <w:szCs w:val="20"/>
+              </w:rPr>
+              <w:t>, failover automatisé</w:t>
             </w:r>
           </w:p>
         </w:tc>
@@ -18966,8 +19624,17 @@
                 <w:sz w:val="20"/>
                 <w:szCs w:val="20"/>
               </w:rPr>
-              <w:t>Cloud Witness</w:t>
-            </w:r>
+              <w:t xml:space="preserve">Cloud </w:t>
+            </w:r>
+            <w:proofErr w:type="spellStart"/>
+            <w:r>
+              <w:rPr>
+                <w:sz w:val="20"/>
+                <w:szCs w:val="20"/>
+              </w:rPr>
+              <w:t>Witness</w:t>
+            </w:r>
+            <w:proofErr w:type="spellEnd"/>
           </w:p>
         </w:tc>
         <w:tc>
@@ -18992,8 +19659,17 @@
                 <w:sz w:val="20"/>
                 <w:szCs w:val="20"/>
               </w:rPr>
-              <w:t>Quorum du cluster on-premise</w:t>
-            </w:r>
+              <w:t>Quorum du cluster on-</w:t>
+            </w:r>
+            <w:proofErr w:type="spellStart"/>
+            <w:r>
+              <w:rPr>
+                <w:sz w:val="20"/>
+                <w:szCs w:val="20"/>
+              </w:rPr>
+              <w:t>premise</w:t>
+            </w:r>
+            <w:proofErr w:type="spellEnd"/>
           </w:p>
         </w:tc>
       </w:tr>
@@ -19376,8 +20052,17 @@
                 <w:sz w:val="20"/>
                 <w:szCs w:val="20"/>
               </w:rPr>
-              <w:t>Azure Site Recovery</w:t>
-            </w:r>
+              <w:t xml:space="preserve">Azure Site </w:t>
+            </w:r>
+            <w:proofErr w:type="spellStart"/>
+            <w:r>
+              <w:rPr>
+                <w:sz w:val="20"/>
+                <w:szCs w:val="20"/>
+              </w:rPr>
+              <w:t>Recovery</w:t>
+            </w:r>
+            <w:proofErr w:type="spellEnd"/>
           </w:p>
         </w:tc>
       </w:tr>
@@ -19513,7 +20198,15 @@
         <w:spacing w:after="60"/>
       </w:pPr>
       <w:r>
-        <w:t>Panne d’un nœud : basculement automatique des VMs sur le nœud restant via le cluster. RTO &lt; 5 min.</w:t>
+        <w:t xml:space="preserve">Panne d’un nœud : basculement automatique des </w:t>
+      </w:r>
+      <w:proofErr w:type="spellStart"/>
+      <w:r>
+        <w:t>VMs</w:t>
+      </w:r>
+      <w:proofErr w:type="spellEnd"/>
+      <w:r>
+        <w:t xml:space="preserve"> sur le nœud restant via le cluster. RTO &lt; 5 min.</w:t>
       </w:r>
     </w:p>
     <w:p>
@@ -19539,7 +20232,23 @@
         <w:spacing w:after="60"/>
       </w:pPr>
       <w:r>
-        <w:t>Sinistre du siège : activation du PRA Azure via Site Recovery. Les 20 VMs démarrent dans Azure.</w:t>
+        <w:t xml:space="preserve">Sinistre du siège : activation du PRA Azure via Site </w:t>
+      </w:r>
+      <w:proofErr w:type="spellStart"/>
+      <w:r>
+        <w:t>Recovery</w:t>
+      </w:r>
+      <w:proofErr w:type="spellEnd"/>
+      <w:r>
+        <w:t xml:space="preserve">. Les 20 </w:t>
+      </w:r>
+      <w:proofErr w:type="spellStart"/>
+      <w:r>
+        <w:t>VMs</w:t>
+      </w:r>
+      <w:proofErr w:type="spellEnd"/>
+      <w:r>
+        <w:t xml:space="preserve"> démarrent dans Azure.</w:t>
       </w:r>
     </w:p>
     <w:p>
@@ -19695,7 +20404,23 @@
                 <w:sz w:val="20"/>
                 <w:szCs w:val="20"/>
               </w:rPr>
-              <w:t>PRTG (500 sensors)</w:t>
+              <w:t xml:space="preserve">PRTG (500 </w:t>
+            </w:r>
+            <w:proofErr w:type="spellStart"/>
+            <w:r>
+              <w:rPr>
+                <w:sz w:val="20"/>
+                <w:szCs w:val="20"/>
+              </w:rPr>
+              <w:t>sensors</w:t>
+            </w:r>
+            <w:proofErr w:type="spellEnd"/>
+            <w:r>
+              <w:rPr>
+                <w:sz w:val="20"/>
+                <w:szCs w:val="20"/>
+              </w:rPr>
+              <w:t>)</w:t>
             </w:r>
           </w:p>
         </w:tc>
@@ -19830,7 +20555,23 @@
                 <w:sz w:val="20"/>
                 <w:szCs w:val="20"/>
               </w:rPr>
-              <w:t>Toutes les VMs, 3 ans</w:t>
+              <w:t xml:space="preserve">Toutes les </w:t>
+            </w:r>
+            <w:proofErr w:type="spellStart"/>
+            <w:r>
+              <w:rPr>
+                <w:sz w:val="20"/>
+                <w:szCs w:val="20"/>
+              </w:rPr>
+              <w:t>VMs</w:t>
+            </w:r>
+            <w:proofErr w:type="spellEnd"/>
+            <w:r>
+              <w:rPr>
+                <w:sz w:val="20"/>
+                <w:szCs w:val="20"/>
+              </w:rPr>
+              <w:t>, 3 ans</w:t>
             </w:r>
           </w:p>
         </w:tc>
@@ -20053,7 +20794,23 @@
                 <w:sz w:val="20"/>
                 <w:szCs w:val="20"/>
               </w:rPr>
-              <w:t>Fibre 1 Gbps (FAI 1)</w:t>
+              <w:t xml:space="preserve">Fibre 1 </w:t>
+            </w:r>
+            <w:proofErr w:type="spellStart"/>
+            <w:r>
+              <w:rPr>
+                <w:sz w:val="20"/>
+                <w:szCs w:val="20"/>
+              </w:rPr>
+              <w:t>Gbps</w:t>
+            </w:r>
+            <w:proofErr w:type="spellEnd"/>
+            <w:r>
+              <w:rPr>
+                <w:sz w:val="20"/>
+                <w:szCs w:val="20"/>
+              </w:rPr>
+              <w:t xml:space="preserve"> (FAI 1)</w:t>
             </w:r>
           </w:p>
         </w:tc>
@@ -20079,7 +20836,23 @@
                 <w:sz w:val="20"/>
                 <w:szCs w:val="20"/>
               </w:rPr>
-              <w:t>Fibre 1 Gbps (FAI 2)</w:t>
+              <w:t xml:space="preserve">Fibre 1 </w:t>
+            </w:r>
+            <w:proofErr w:type="spellStart"/>
+            <w:r>
+              <w:rPr>
+                <w:sz w:val="20"/>
+                <w:szCs w:val="20"/>
+              </w:rPr>
+              <w:t>Gbps</w:t>
+            </w:r>
+            <w:proofErr w:type="spellEnd"/>
+            <w:r>
+              <w:rPr>
+                <w:sz w:val="20"/>
+                <w:szCs w:val="20"/>
+              </w:rPr>
+              <w:t xml:space="preserve"> (FAI 2)</w:t>
             </w:r>
           </w:p>
         </w:tc>
@@ -20537,7 +21310,23 @@
                 <w:sz w:val="20"/>
                 <w:szCs w:val="20"/>
               </w:rPr>
-              <w:t>Sécurisé par FortiGate 40F</w:t>
+              <w:t xml:space="preserve">Sécurisé par </w:t>
+            </w:r>
+            <w:proofErr w:type="spellStart"/>
+            <w:r>
+              <w:rPr>
+                <w:sz w:val="20"/>
+                <w:szCs w:val="20"/>
+              </w:rPr>
+              <w:t>FortiGate</w:t>
+            </w:r>
+            <w:proofErr w:type="spellEnd"/>
+            <w:r>
+              <w:rPr>
+                <w:sz w:val="20"/>
+                <w:szCs w:val="20"/>
+              </w:rPr>
+              <w:t xml:space="preserve"> 40F</w:t>
             </w:r>
           </w:p>
         </w:tc>
@@ -20729,12 +21518,21 @@
             </w:tcMar>
           </w:tcPr>
           <w:p>
-            <w:r>
-              <w:rPr>
-                <w:sz w:val="20"/>
-                <w:szCs w:val="20"/>
-              </w:rPr>
-              <w:t>FortiGate 100F (siège)</w:t>
+            <w:proofErr w:type="spellStart"/>
+            <w:r>
+              <w:rPr>
+                <w:sz w:val="20"/>
+                <w:szCs w:val="20"/>
+              </w:rPr>
+              <w:t>FortiGate</w:t>
+            </w:r>
+            <w:proofErr w:type="spellEnd"/>
+            <w:r>
+              <w:rPr>
+                <w:sz w:val="20"/>
+                <w:szCs w:val="20"/>
+              </w:rPr>
+              <w:t xml:space="preserve"> 100F (siège)</w:t>
             </w:r>
           </w:p>
         </w:tc>
@@ -20810,12 +21608,21 @@
             </w:tcMar>
           </w:tcPr>
           <w:p>
-            <w:r>
-              <w:rPr>
-                <w:sz w:val="20"/>
-                <w:szCs w:val="20"/>
-              </w:rPr>
-              <w:t>FortiGate 60F (entrepôts)</w:t>
+            <w:proofErr w:type="spellStart"/>
+            <w:r>
+              <w:rPr>
+                <w:sz w:val="20"/>
+                <w:szCs w:val="20"/>
+              </w:rPr>
+              <w:t>FortiGate</w:t>
+            </w:r>
+            <w:proofErr w:type="spellEnd"/>
+            <w:r>
+              <w:rPr>
+                <w:sz w:val="20"/>
+                <w:szCs w:val="20"/>
+              </w:rPr>
+              <w:t xml:space="preserve"> 60F (entrepôts)</w:t>
             </w:r>
           </w:p>
         </w:tc>
@@ -20892,12 +21699,21 @@
             </w:tcMar>
           </w:tcPr>
           <w:p>
-            <w:r>
-              <w:rPr>
-                <w:sz w:val="20"/>
-                <w:szCs w:val="20"/>
-              </w:rPr>
-              <w:t>FortiGate 40F (backup)</w:t>
+            <w:proofErr w:type="spellStart"/>
+            <w:r>
+              <w:rPr>
+                <w:sz w:val="20"/>
+                <w:szCs w:val="20"/>
+              </w:rPr>
+              <w:t>FortiGate</w:t>
+            </w:r>
+            <w:proofErr w:type="spellEnd"/>
+            <w:r>
+              <w:rPr>
+                <w:sz w:val="20"/>
+                <w:szCs w:val="20"/>
+              </w:rPr>
+              <w:t xml:space="preserve"> 40F (backup)</w:t>
             </w:r>
           </w:p>
         </w:tc>
@@ -20978,7 +21794,23 @@
                 <w:sz w:val="20"/>
                 <w:szCs w:val="20"/>
               </w:rPr>
-              <w:t>Licences FortiCare 3 ans</w:t>
+              <w:t xml:space="preserve">Licences </w:t>
+            </w:r>
+            <w:proofErr w:type="spellStart"/>
+            <w:r>
+              <w:rPr>
+                <w:sz w:val="20"/>
+                <w:szCs w:val="20"/>
+              </w:rPr>
+              <w:t>FortiCare</w:t>
+            </w:r>
+            <w:proofErr w:type="spellEnd"/>
+            <w:r>
+              <w:rPr>
+                <w:sz w:val="20"/>
+                <w:szCs w:val="20"/>
+              </w:rPr>
+              <w:t xml:space="preserve"> 3 ans</w:t>
             </w:r>
           </w:p>
         </w:tc>
@@ -21348,12 +22180,21 @@
             </w:tcMar>
           </w:tcPr>
           <w:p>
-            <w:r>
-              <w:rPr>
-                <w:sz w:val="20"/>
-                <w:szCs w:val="20"/>
-              </w:rPr>
-              <w:t>ProSupport Dell 3 ans</w:t>
+            <w:proofErr w:type="spellStart"/>
+            <w:r>
+              <w:rPr>
+                <w:sz w:val="20"/>
+                <w:szCs w:val="20"/>
+              </w:rPr>
+              <w:t>ProSupport</w:t>
+            </w:r>
+            <w:proofErr w:type="spellEnd"/>
+            <w:r>
+              <w:rPr>
+                <w:sz w:val="20"/>
+                <w:szCs w:val="20"/>
+              </w:rPr>
+              <w:t xml:space="preserve"> Dell 3 ans</w:t>
             </w:r>
           </w:p>
         </w:tc>
@@ -21647,7 +22488,23 @@
                 <w:sz w:val="20"/>
                 <w:szCs w:val="20"/>
               </w:rPr>
-              <w:t>Dell PowerVault ME5012</w:t>
+              <w:t xml:space="preserve">Dell </w:t>
+            </w:r>
+            <w:proofErr w:type="spellStart"/>
+            <w:r>
+              <w:rPr>
+                <w:sz w:val="20"/>
+                <w:szCs w:val="20"/>
+              </w:rPr>
+              <w:t>PowerVault</w:t>
+            </w:r>
+            <w:proofErr w:type="spellEnd"/>
+            <w:r>
+              <w:rPr>
+                <w:sz w:val="20"/>
+                <w:szCs w:val="20"/>
+              </w:rPr>
+              <w:t xml:space="preserve"> ME5012</w:t>
             </w:r>
           </w:p>
         </w:tc>
@@ -22098,12 +22955,21 @@
             </w:tcMar>
           </w:tcPr>
           <w:p>
-            <w:r>
-              <w:rPr>
-                <w:sz w:val="20"/>
-                <w:szCs w:val="20"/>
-              </w:rPr>
-              <w:t>SmartNet 3 ans</w:t>
+            <w:proofErr w:type="spellStart"/>
+            <w:r>
+              <w:rPr>
+                <w:sz w:val="20"/>
+                <w:szCs w:val="20"/>
+              </w:rPr>
+              <w:t>SmartNet</w:t>
+            </w:r>
+            <w:proofErr w:type="spellEnd"/>
+            <w:r>
+              <w:rPr>
+                <w:sz w:val="20"/>
+                <w:szCs w:val="20"/>
+              </w:rPr>
+              <w:t xml:space="preserve"> 3 ans</w:t>
             </w:r>
           </w:p>
         </w:tc>
@@ -22397,8 +23263,17 @@
                 <w:sz w:val="20"/>
                 <w:szCs w:val="20"/>
               </w:rPr>
-              <w:t>Azure Site Recovery</w:t>
-            </w:r>
+              <w:t xml:space="preserve">Azure Site </w:t>
+            </w:r>
+            <w:proofErr w:type="spellStart"/>
+            <w:r>
+              <w:rPr>
+                <w:sz w:val="20"/>
+                <w:szCs w:val="20"/>
+              </w:rPr>
+              <w:t>Recovery</w:t>
+            </w:r>
+            <w:proofErr w:type="spellEnd"/>
           </w:p>
         </w:tc>
         <w:tc>
@@ -22423,7 +23298,23 @@
                 <w:sz w:val="20"/>
                 <w:szCs w:val="20"/>
               </w:rPr>
-              <w:t>20 VMs x 23 €/mois x 36 mois</w:t>
+              <w:t xml:space="preserve">20 </w:t>
+            </w:r>
+            <w:proofErr w:type="spellStart"/>
+            <w:r>
+              <w:rPr>
+                <w:sz w:val="20"/>
+                <w:szCs w:val="20"/>
+              </w:rPr>
+              <w:t>VMs</w:t>
+            </w:r>
+            <w:proofErr w:type="spellEnd"/>
+            <w:r>
+              <w:rPr>
+                <w:sz w:val="20"/>
+                <w:szCs w:val="20"/>
+              </w:rPr>
+              <w:t xml:space="preserve"> x 23 €/mois x 36 mois</w:t>
             </w:r>
           </w:p>
         </w:tc>
@@ -22478,8 +23369,17 @@
                 <w:sz w:val="20"/>
                 <w:szCs w:val="20"/>
               </w:rPr>
-              <w:t>Stockage replica</w:t>
-            </w:r>
+              <w:t xml:space="preserve">Stockage </w:t>
+            </w:r>
+            <w:proofErr w:type="spellStart"/>
+            <w:r>
+              <w:rPr>
+                <w:sz w:val="20"/>
+                <w:szCs w:val="20"/>
+              </w:rPr>
+              <w:t>replica</w:t>
+            </w:r>
+            <w:proofErr w:type="spellEnd"/>
           </w:p>
         </w:tc>
         <w:tc>
@@ -22511,8 +23411,18 @@
                 <w:szCs w:val="20"/>
                 <w:lang w:val="en-US"/>
               </w:rPr>
-              <w:t>500 Go x 0.02 €/Go x 36 mois</w:t>
-            </w:r>
+              <w:t xml:space="preserve">500 Go x 0.02 €/Go x 36 </w:t>
+            </w:r>
+            <w:proofErr w:type="spellStart"/>
+            <w:r>
+              <w:rPr>
+                <w:sz w:val="20"/>
+                <w:szCs w:val="20"/>
+                <w:lang w:val="en-US"/>
+              </w:rPr>
+              <w:t>mois</w:t>
+            </w:r>
+            <w:proofErr w:type="spellEnd"/>
           </w:p>
         </w:tc>
         <w:tc>
@@ -22566,8 +23476,17 @@
                 <w:sz w:val="20"/>
                 <w:szCs w:val="20"/>
               </w:rPr>
-              <w:t>Snapshots + Egress</w:t>
-            </w:r>
+              <w:t xml:space="preserve">Snapshots + </w:t>
+            </w:r>
+            <w:proofErr w:type="spellStart"/>
+            <w:r>
+              <w:rPr>
+                <w:sz w:val="20"/>
+                <w:szCs w:val="20"/>
+              </w:rPr>
+              <w:t>Egress</w:t>
+            </w:r>
+            <w:proofErr w:type="spellEnd"/>
           </w:p>
         </w:tc>
         <w:tc>
@@ -22648,7 +23567,23 @@
                 <w:szCs w:val="20"/>
               </w:rPr>
               <w:lastRenderedPageBreak/>
-              <w:t>Réduction Reserved 3 ans</w:t>
+              <w:t xml:space="preserve">Réduction </w:t>
+            </w:r>
+            <w:proofErr w:type="spellStart"/>
+            <w:r>
+              <w:rPr>
+                <w:sz w:val="20"/>
+                <w:szCs w:val="20"/>
+              </w:rPr>
+              <w:t>Reserved</w:t>
+            </w:r>
+            <w:proofErr w:type="spellEnd"/>
+            <w:r>
+              <w:rPr>
+                <w:sz w:val="20"/>
+                <w:szCs w:val="20"/>
+              </w:rPr>
+              <w:t xml:space="preserve"> 3 ans</w:t>
             </w:r>
           </w:p>
         </w:tc>
@@ -22942,8 +23877,17 @@
                 <w:sz w:val="20"/>
                 <w:szCs w:val="20"/>
               </w:rPr>
-              <w:t>PRTG 500 sensors</w:t>
-            </w:r>
+              <w:t xml:space="preserve">PRTG 500 </w:t>
+            </w:r>
+            <w:proofErr w:type="spellStart"/>
+            <w:r>
+              <w:rPr>
+                <w:sz w:val="20"/>
+                <w:szCs w:val="20"/>
+              </w:rPr>
+              <w:t>sensors</w:t>
+            </w:r>
+            <w:proofErr w:type="spellEnd"/>
           </w:p>
         </w:tc>
         <w:tc>
@@ -23317,7 +24261,23 @@
                 <w:sz w:val="20"/>
                 <w:szCs w:val="20"/>
               </w:rPr>
-              <w:t>Siège : Fibre 1 Gbps x 2 FAI</w:t>
+              <w:t xml:space="preserve">Siège : Fibre 1 </w:t>
+            </w:r>
+            <w:proofErr w:type="spellStart"/>
+            <w:r>
+              <w:rPr>
+                <w:sz w:val="20"/>
+                <w:szCs w:val="20"/>
+              </w:rPr>
+              <w:t>Gbps</w:t>
+            </w:r>
+            <w:proofErr w:type="spellEnd"/>
+            <w:r>
+              <w:rPr>
+                <w:sz w:val="20"/>
+                <w:szCs w:val="20"/>
+              </w:rPr>
+              <w:t xml:space="preserve"> x 2 FAI</w:t>
             </w:r>
           </w:p>
         </w:tc>
@@ -24521,8 +25481,17 @@
                 <w:sz w:val="20"/>
                 <w:szCs w:val="20"/>
               </w:rPr>
-              <w:t>Azure Site Recovery</w:t>
-            </w:r>
+              <w:t xml:space="preserve">Azure Site </w:t>
+            </w:r>
+            <w:proofErr w:type="spellStart"/>
+            <w:r>
+              <w:rPr>
+                <w:sz w:val="20"/>
+                <w:szCs w:val="20"/>
+              </w:rPr>
+              <w:t>Recovery</w:t>
+            </w:r>
+            <w:proofErr w:type="spellEnd"/>
           </w:p>
         </w:tc>
         <w:tc>
@@ -24547,7 +25516,39 @@
                 <w:sz w:val="20"/>
                 <w:szCs w:val="20"/>
               </w:rPr>
-              <w:t>20 VMs x 23 €/mois (après Reserved)</w:t>
+              <w:t xml:space="preserve">20 </w:t>
+            </w:r>
+            <w:proofErr w:type="spellStart"/>
+            <w:r>
+              <w:rPr>
+                <w:sz w:val="20"/>
+                <w:szCs w:val="20"/>
+              </w:rPr>
+              <w:t>VMs</w:t>
+            </w:r>
+            <w:proofErr w:type="spellEnd"/>
+            <w:r>
+              <w:rPr>
+                <w:sz w:val="20"/>
+                <w:szCs w:val="20"/>
+              </w:rPr>
+              <w:t xml:space="preserve"> x 23 €/mois (après </w:t>
+            </w:r>
+            <w:proofErr w:type="spellStart"/>
+            <w:r>
+              <w:rPr>
+                <w:sz w:val="20"/>
+                <w:szCs w:val="20"/>
+              </w:rPr>
+              <w:t>Reserved</w:t>
+            </w:r>
+            <w:proofErr w:type="spellEnd"/>
+            <w:r>
+              <w:rPr>
+                <w:sz w:val="20"/>
+                <w:szCs w:val="20"/>
+              </w:rPr>
+              <w:t>)</w:t>
             </w:r>
           </w:p>
         </w:tc>
@@ -24711,7 +25712,23 @@
                 <w:sz w:val="20"/>
                 <w:szCs w:val="20"/>
               </w:rPr>
-              <w:t>PRTG 500 sensors + Veeam Essentials</w:t>
+              <w:t xml:space="preserve">PRTG 500 </w:t>
+            </w:r>
+            <w:proofErr w:type="spellStart"/>
+            <w:r>
+              <w:rPr>
+                <w:sz w:val="20"/>
+                <w:szCs w:val="20"/>
+              </w:rPr>
+              <w:t>sensors</w:t>
+            </w:r>
+            <w:proofErr w:type="spellEnd"/>
+            <w:r>
+              <w:rPr>
+                <w:sz w:val="20"/>
+                <w:szCs w:val="20"/>
+              </w:rPr>
+              <w:t xml:space="preserve"> + Veeam Essentials</w:t>
             </w:r>
           </w:p>
         </w:tc>
@@ -25234,6 +26251,7 @@
             </w:tcMar>
           </w:tcPr>
           <w:p>
+            <w:proofErr w:type="spellStart"/>
             <w:r>
               <w:rPr>
                 <w:sz w:val="20"/>
@@ -25241,6 +26259,7 @@
               </w:rPr>
               <w:t>FortiGate</w:t>
             </w:r>
+            <w:proofErr w:type="spellEnd"/>
           </w:p>
         </w:tc>
         <w:tc>
@@ -25321,7 +26340,23 @@
                 <w:sz w:val="20"/>
                 <w:szCs w:val="20"/>
               </w:rPr>
-              <w:t>Performance pour 20+ VMs, évolutif en RAM et disques</w:t>
+              <w:t xml:space="preserve">Performance pour 20+ </w:t>
+            </w:r>
+            <w:proofErr w:type="spellStart"/>
+            <w:r>
+              <w:rPr>
+                <w:sz w:val="20"/>
+                <w:szCs w:val="20"/>
+              </w:rPr>
+              <w:t>VMs</w:t>
+            </w:r>
+            <w:proofErr w:type="spellEnd"/>
+            <w:r>
+              <w:rPr>
+                <w:sz w:val="20"/>
+                <w:szCs w:val="20"/>
+              </w:rPr>
+              <w:t>, évolutif en RAM et disques</w:t>
             </w:r>
           </w:p>
         </w:tc>
@@ -25375,7 +26410,23 @@
                 <w:sz w:val="20"/>
                 <w:szCs w:val="20"/>
               </w:rPr>
-              <w:t>Séparation compute/stockage, prérequis pour le cluster HA</w:t>
+              <w:t xml:space="preserve">Séparation </w:t>
+            </w:r>
+            <w:proofErr w:type="spellStart"/>
+            <w:r>
+              <w:rPr>
+                <w:sz w:val="20"/>
+                <w:szCs w:val="20"/>
+              </w:rPr>
+              <w:t>compute</w:t>
+            </w:r>
+            <w:proofErr w:type="spellEnd"/>
+            <w:r>
+              <w:rPr>
+                <w:sz w:val="20"/>
+                <w:szCs w:val="20"/>
+              </w:rPr>
+              <w:t>/stockage, prérequis pour le cluster HA</w:t>
             </w:r>
           </w:p>
         </w:tc>
@@ -25431,7 +26482,39 @@
                 <w:sz w:val="20"/>
                 <w:szCs w:val="20"/>
               </w:rPr>
-              <w:t>QoS native VoIP, support enterprise, PoE pour téléphones</w:t>
+              <w:t xml:space="preserve">QoS native </w:t>
+            </w:r>
+            <w:proofErr w:type="spellStart"/>
+            <w:r>
+              <w:rPr>
+                <w:sz w:val="20"/>
+                <w:szCs w:val="20"/>
+              </w:rPr>
+              <w:t>VoIP</w:t>
+            </w:r>
+            <w:proofErr w:type="spellEnd"/>
+            <w:r>
+              <w:rPr>
+                <w:sz w:val="20"/>
+                <w:szCs w:val="20"/>
+              </w:rPr>
+              <w:t xml:space="preserve">, support </w:t>
+            </w:r>
+            <w:proofErr w:type="spellStart"/>
+            <w:r>
+              <w:rPr>
+                <w:sz w:val="20"/>
+                <w:szCs w:val="20"/>
+              </w:rPr>
+              <w:t>enterprise</w:t>
+            </w:r>
+            <w:proofErr w:type="spellEnd"/>
+            <w:r>
+              <w:rPr>
+                <w:sz w:val="20"/>
+                <w:szCs w:val="20"/>
+              </w:rPr>
+              <w:t>, PoE pour téléphones</w:t>
             </w:r>
           </w:p>
         </w:tc>
@@ -25459,7 +26542,23 @@
                 <w:sz w:val="20"/>
                 <w:szCs w:val="20"/>
               </w:rPr>
-              <w:t>Azure Reserved 3 ans</w:t>
+              <w:t xml:space="preserve">Azure </w:t>
+            </w:r>
+            <w:proofErr w:type="spellStart"/>
+            <w:r>
+              <w:rPr>
+                <w:sz w:val="20"/>
+                <w:szCs w:val="20"/>
+              </w:rPr>
+              <w:t>Reserved</w:t>
+            </w:r>
+            <w:proofErr w:type="spellEnd"/>
+            <w:r>
+              <w:rPr>
+                <w:sz w:val="20"/>
+                <w:szCs w:val="20"/>
+              </w:rPr>
+              <w:t xml:space="preserve"> 3 ans</w:t>
             </w:r>
           </w:p>
         </w:tc>
@@ -25569,7 +26668,15 @@
       </w:pPr>
       <w:bookmarkStart w:id="56" w:name="_Toc222085263"/>
       <w:r>
-        <w:t>5.1 Correspondance Lab / Production</w:t>
+        <w:t xml:space="preserve">5.1 Correspondance </w:t>
+      </w:r>
+      <w:proofErr w:type="spellStart"/>
+      <w:r>
+        <w:t>Lab</w:t>
+      </w:r>
+      <w:proofErr w:type="spellEnd"/>
+      <w:r>
+        <w:t xml:space="preserve"> / Production</w:t>
       </w:r>
       <w:bookmarkEnd w:id="56"/>
     </w:p>
@@ -25578,7 +26685,15 @@
         <w:spacing w:after="120"/>
       </w:pPr>
       <w:r>
-        <w:t>Le lab POC utilise des équivalents open-source pour simuler l’architecture cible à coût zéro.</w:t>
+        <w:t xml:space="preserve">Le </w:t>
+      </w:r>
+      <w:proofErr w:type="spellStart"/>
+      <w:r>
+        <w:t>lab</w:t>
+      </w:r>
+      <w:proofErr w:type="spellEnd"/>
+      <w:r>
+        <w:t xml:space="preserve"> POC utilise des équivalents open-source pour simuler l’architecture cible à coût zéro.</w:t>
       </w:r>
     </w:p>
     <w:tbl>
@@ -25689,6 +26804,7 @@
             <w:vAlign w:val="center"/>
           </w:tcPr>
           <w:p>
+            <w:proofErr w:type="spellStart"/>
             <w:r>
               <w:rPr>
                 <w:b/>
@@ -25697,29 +26813,9 @@
                 <w:sz w:val="20"/>
                 <w:szCs w:val="20"/>
               </w:rPr>
-              <w:t>Lab (POC)</w:t>
-            </w:r>
-          </w:p>
-        </w:tc>
-        <w:tc>
-          <w:tcPr>
-            <w:tcW w:w="2400" w:type="dxa"/>
-            <w:tcBorders>
-              <w:top w:val="single" w:sz="1" w:space="0" w:color="B0C4DE"/>
-              <w:left w:val="single" w:sz="1" w:space="0" w:color="B0C4DE"/>
-              <w:bottom w:val="single" w:sz="1" w:space="0" w:color="B0C4DE"/>
-              <w:right w:val="single" w:sz="1" w:space="0" w:color="B0C4DE"/>
-            </w:tcBorders>
-            <w:shd w:val="clear" w:color="auto" w:fill="1B4F72"/>
-            <w:tcMar>
-              <w:top w:w="60" w:type="dxa"/>
-              <w:left w:w="100" w:type="dxa"/>
-              <w:bottom w:w="60" w:type="dxa"/>
-              <w:right w:w="100" w:type="dxa"/>
-            </w:tcMar>
-            <w:vAlign w:val="center"/>
-          </w:tcPr>
-          <w:p>
+              <w:t>Lab</w:t>
+            </w:r>
+            <w:proofErr w:type="spellEnd"/>
             <w:r>
               <w:rPr>
                 <w:b/>
@@ -25728,6 +26824,37 @@
                 <w:sz w:val="20"/>
                 <w:szCs w:val="20"/>
               </w:rPr>
+              <w:t xml:space="preserve"> (POC)</w:t>
+            </w:r>
+          </w:p>
+        </w:tc>
+        <w:tc>
+          <w:tcPr>
+            <w:tcW w:w="2400" w:type="dxa"/>
+            <w:tcBorders>
+              <w:top w:val="single" w:sz="1" w:space="0" w:color="B0C4DE"/>
+              <w:left w:val="single" w:sz="1" w:space="0" w:color="B0C4DE"/>
+              <w:bottom w:val="single" w:sz="1" w:space="0" w:color="B0C4DE"/>
+              <w:right w:val="single" w:sz="1" w:space="0" w:color="B0C4DE"/>
+            </w:tcBorders>
+            <w:shd w:val="clear" w:color="auto" w:fill="1B4F72"/>
+            <w:tcMar>
+              <w:top w:w="60" w:type="dxa"/>
+              <w:left w:w="100" w:type="dxa"/>
+              <w:bottom w:w="60" w:type="dxa"/>
+              <w:right w:w="100" w:type="dxa"/>
+            </w:tcMar>
+            <w:vAlign w:val="center"/>
+          </w:tcPr>
+          <w:p>
+            <w:r>
+              <w:rPr>
+                <w:b/>
+                <w:bCs/>
+                <w:color w:val="FFFFFF"/>
+                <w:sz w:val="20"/>
+                <w:szCs w:val="20"/>
+              </w:rPr>
               <w:t>Justification</w:t>
             </w:r>
           </w:p>
@@ -25777,12 +26904,21 @@
             </w:tcMar>
           </w:tcPr>
           <w:p>
-            <w:r>
-              <w:rPr>
-                <w:sz w:val="20"/>
-                <w:szCs w:val="20"/>
-              </w:rPr>
-              <w:t>FortiGate 100F/60F</w:t>
+            <w:proofErr w:type="spellStart"/>
+            <w:r>
+              <w:rPr>
+                <w:sz w:val="20"/>
+                <w:szCs w:val="20"/>
+              </w:rPr>
+              <w:t>FortiGate</w:t>
+            </w:r>
+            <w:proofErr w:type="spellEnd"/>
+            <w:r>
+              <w:rPr>
+                <w:sz w:val="20"/>
+                <w:szCs w:val="20"/>
+              </w:rPr>
+              <w:t xml:space="preserve"> 100F/60F</w:t>
             </w:r>
           </w:p>
         </w:tc>
@@ -25803,12 +26939,21 @@
             </w:tcMar>
           </w:tcPr>
           <w:p>
-            <w:r>
-              <w:rPr>
-                <w:sz w:val="20"/>
-                <w:szCs w:val="20"/>
-              </w:rPr>
-              <w:t>pfSense CE 2.7</w:t>
+            <w:proofErr w:type="spellStart"/>
+            <w:r>
+              <w:rPr>
+                <w:sz w:val="20"/>
+                <w:szCs w:val="20"/>
+              </w:rPr>
+              <w:t>pfSense</w:t>
+            </w:r>
+            <w:proofErr w:type="spellEnd"/>
+            <w:r>
+              <w:rPr>
+                <w:sz w:val="20"/>
+                <w:szCs w:val="20"/>
+              </w:rPr>
+              <w:t xml:space="preserve"> CE 2.7</w:t>
             </w:r>
           </w:p>
         </w:tc>
@@ -25885,12 +27030,21 @@
             </w:tcMar>
           </w:tcPr>
           <w:p>
-            <w:r>
-              <w:rPr>
-                <w:sz w:val="20"/>
-                <w:szCs w:val="20"/>
-              </w:rPr>
-              <w:t>IPsec IKEv2 AES-256</w:t>
+            <w:proofErr w:type="spellStart"/>
+            <w:r>
+              <w:rPr>
+                <w:sz w:val="20"/>
+                <w:szCs w:val="20"/>
+              </w:rPr>
+              <w:t>IPsec</w:t>
+            </w:r>
+            <w:proofErr w:type="spellEnd"/>
+            <w:r>
+              <w:rPr>
+                <w:sz w:val="20"/>
+                <w:szCs w:val="20"/>
+              </w:rPr>
+              <w:t xml:space="preserve"> IKEv2 AES-256</w:t>
             </w:r>
           </w:p>
         </w:tc>
@@ -25998,7 +27152,23 @@
                 <w:sz w:val="20"/>
                 <w:szCs w:val="20"/>
               </w:rPr>
-              <w:t>3 DCs Windows Server 2022</w:t>
+              <w:t xml:space="preserve">3 </w:t>
+            </w:r>
+            <w:proofErr w:type="spellStart"/>
+            <w:r>
+              <w:rPr>
+                <w:sz w:val="20"/>
+                <w:szCs w:val="20"/>
+              </w:rPr>
+              <w:t>DCs</w:t>
+            </w:r>
+            <w:proofErr w:type="spellEnd"/>
+            <w:r>
+              <w:rPr>
+                <w:sz w:val="20"/>
+                <w:szCs w:val="20"/>
+              </w:rPr>
+              <w:t xml:space="preserve"> Windows Server 2022</w:t>
             </w:r>
           </w:p>
         </w:tc>
@@ -26024,7 +27194,23 @@
                 <w:sz w:val="20"/>
                 <w:szCs w:val="20"/>
               </w:rPr>
-              <w:t>3 DCs Windows Server 2022</w:t>
+              <w:t xml:space="preserve">3 </w:t>
+            </w:r>
+            <w:proofErr w:type="spellStart"/>
+            <w:r>
+              <w:rPr>
+                <w:sz w:val="20"/>
+                <w:szCs w:val="20"/>
+              </w:rPr>
+              <w:t>DCs</w:t>
+            </w:r>
+            <w:proofErr w:type="spellEnd"/>
+            <w:r>
+              <w:rPr>
+                <w:sz w:val="20"/>
+                <w:szCs w:val="20"/>
+              </w:rPr>
+              <w:t xml:space="preserve"> Windows Server 2022</w:t>
             </w:r>
           </w:p>
         </w:tc>
@@ -26079,8 +27265,17 @@
                 <w:sz w:val="20"/>
                 <w:szCs w:val="20"/>
               </w:rPr>
-              <w:t>IPBX / VoIP</w:t>
-            </w:r>
+              <w:t xml:space="preserve">IPBX / </w:t>
+            </w:r>
+            <w:proofErr w:type="spellStart"/>
+            <w:r>
+              <w:rPr>
+                <w:sz w:val="20"/>
+                <w:szCs w:val="20"/>
+              </w:rPr>
+              <w:t>VoIP</w:t>
+            </w:r>
+            <w:proofErr w:type="spellEnd"/>
           </w:p>
         </w:tc>
         <w:tc>
@@ -26106,8 +27301,17 @@
                 <w:sz w:val="20"/>
                 <w:szCs w:val="20"/>
               </w:rPr>
-              <w:t>IPBX + QoS FortiGate</w:t>
-            </w:r>
+              <w:t xml:space="preserve">IPBX + QoS </w:t>
+            </w:r>
+            <w:proofErr w:type="spellStart"/>
+            <w:r>
+              <w:rPr>
+                <w:sz w:val="20"/>
+                <w:szCs w:val="20"/>
+              </w:rPr>
+              <w:t>FortiGate</w:t>
+            </w:r>
+            <w:proofErr w:type="spellEnd"/>
           </w:p>
         </w:tc>
         <w:tc>
@@ -26128,13 +27332,31 @@
             </w:tcMar>
           </w:tcPr>
           <w:p>
-            <w:r>
-              <w:rPr>
-                <w:sz w:val="20"/>
-                <w:szCs w:val="20"/>
-              </w:rPr>
-              <w:t>FreePBX 16 + QoS pfSense</w:t>
-            </w:r>
+            <w:proofErr w:type="spellStart"/>
+            <w:r>
+              <w:rPr>
+                <w:sz w:val="20"/>
+                <w:szCs w:val="20"/>
+              </w:rPr>
+              <w:t>FreePBX</w:t>
+            </w:r>
+            <w:proofErr w:type="spellEnd"/>
+            <w:r>
+              <w:rPr>
+                <w:sz w:val="20"/>
+                <w:szCs w:val="20"/>
+              </w:rPr>
+              <w:t xml:space="preserve"> 16 + QoS </w:t>
+            </w:r>
+            <w:proofErr w:type="spellStart"/>
+            <w:r>
+              <w:rPr>
+                <w:sz w:val="20"/>
+                <w:szCs w:val="20"/>
+              </w:rPr>
+              <w:t>pfSense</w:t>
+            </w:r>
+            <w:proofErr w:type="spellEnd"/>
           </w:p>
         </w:tc>
         <w:tc>
@@ -26344,12 +27566,21 @@
             </w:tcMar>
           </w:tcPr>
           <w:p>
-            <w:r>
-              <w:rPr>
-                <w:sz w:val="20"/>
-                <w:szCs w:val="20"/>
-              </w:rPr>
-              <w:t>Proxmox VE (unique)</w:t>
+            <w:proofErr w:type="spellStart"/>
+            <w:r>
+              <w:rPr>
+                <w:sz w:val="20"/>
+                <w:szCs w:val="20"/>
+              </w:rPr>
+              <w:t>Proxmox</w:t>
+            </w:r>
+            <w:proofErr w:type="spellEnd"/>
+            <w:r>
+              <w:rPr>
+                <w:sz w:val="20"/>
+                <w:szCs w:val="20"/>
+              </w:rPr>
+              <w:t xml:space="preserve"> VE (unique)</w:t>
             </w:r>
           </w:p>
         </w:tc>
@@ -26403,7 +27634,51 @@
           <w:sz w:val="21"/>
           <w:szCs w:val="21"/>
         </w:rPr>
-        <w:t>Limite assumée : le lab ne reproduit pas le failover de cluster physique. Ce scénario est couvert par les spécifications Dell et les garanties ProSupport.</w:t>
+        <w:t xml:space="preserve">Limite assumée : le </w:t>
+      </w:r>
+      <w:proofErr w:type="spellStart"/>
+      <w:r>
+        <w:rPr>
+          <w:i/>
+          <w:iCs/>
+          <w:color w:val="555555"/>
+          <w:sz w:val="21"/>
+          <w:szCs w:val="21"/>
+        </w:rPr>
+        <w:t>lab</w:t>
+      </w:r>
+      <w:proofErr w:type="spellEnd"/>
+      <w:r>
+        <w:rPr>
+          <w:i/>
+          <w:iCs/>
+          <w:color w:val="555555"/>
+          <w:sz w:val="21"/>
+          <w:szCs w:val="21"/>
+        </w:rPr>
+        <w:t xml:space="preserve"> ne reproduit pas le failover de cluster physique. Ce scénario est couvert par les spécifications Dell et les garanties </w:t>
+      </w:r>
+      <w:proofErr w:type="spellStart"/>
+      <w:r>
+        <w:rPr>
+          <w:i/>
+          <w:iCs/>
+          <w:color w:val="555555"/>
+          <w:sz w:val="21"/>
+          <w:szCs w:val="21"/>
+        </w:rPr>
+        <w:t>ProSupport</w:t>
+      </w:r>
+      <w:proofErr w:type="spellEnd"/>
+      <w:r>
+        <w:rPr>
+          <w:i/>
+          <w:iCs/>
+          <w:color w:val="555555"/>
+          <w:sz w:val="21"/>
+          <w:szCs w:val="21"/>
+        </w:rPr>
+        <w:t>.</w:t>
       </w:r>
     </w:p>
     <w:p>
@@ -26548,12 +27823,21 @@
             </w:tcMar>
           </w:tcPr>
           <w:p>
-            <w:r>
-              <w:rPr>
-                <w:sz w:val="20"/>
-                <w:szCs w:val="20"/>
-              </w:rPr>
-              <w:t>Proxmox VE 9.1.4</w:t>
+            <w:proofErr w:type="spellStart"/>
+            <w:r>
+              <w:rPr>
+                <w:sz w:val="20"/>
+                <w:szCs w:val="20"/>
+              </w:rPr>
+              <w:t>Proxmox</w:t>
+            </w:r>
+            <w:proofErr w:type="spellEnd"/>
+            <w:r>
+              <w:rPr>
+                <w:sz w:val="20"/>
+                <w:szCs w:val="20"/>
+              </w:rPr>
+              <w:t xml:space="preserve"> VE 9.1.4</w:t>
             </w:r>
           </w:p>
         </w:tc>
@@ -26643,8 +27927,17 @@
                 <w:sz w:val="20"/>
                 <w:szCs w:val="20"/>
               </w:rPr>
-              <w:t>Réseau lab</w:t>
-            </w:r>
+              <w:t xml:space="preserve">Réseau </w:t>
+            </w:r>
+            <w:proofErr w:type="spellStart"/>
+            <w:r>
+              <w:rPr>
+                <w:sz w:val="20"/>
+                <w:szCs w:val="20"/>
+              </w:rPr>
+              <w:t>lab</w:t>
+            </w:r>
+            <w:proofErr w:type="spellEnd"/>
           </w:p>
         </w:tc>
         <w:tc>
@@ -26698,8 +27991,17 @@
                 <w:sz w:val="20"/>
                 <w:szCs w:val="20"/>
               </w:rPr>
-              <w:t>Nombre de VMs</w:t>
-            </w:r>
+              <w:t xml:space="preserve">Nombre de </w:t>
+            </w:r>
+            <w:proofErr w:type="spellStart"/>
+            <w:r>
+              <w:rPr>
+                <w:sz w:val="20"/>
+                <w:szCs w:val="20"/>
+              </w:rPr>
+              <w:t>VMs</w:t>
+            </w:r>
+            <w:proofErr w:type="spellEnd"/>
           </w:p>
         </w:tc>
         <w:tc>
@@ -26731,7 +28033,43 @@
                 <w:szCs w:val="20"/>
                 <w:lang w:val="en-US"/>
               </w:rPr>
-              <w:t>7 (2x pfSense, 3x Windows Server, 1x Ubuntu, 1x FreePBX)</w:t>
+              <w:t xml:space="preserve">7 (2x </w:t>
+            </w:r>
+            <w:proofErr w:type="spellStart"/>
+            <w:r>
+              <w:rPr>
+                <w:sz w:val="20"/>
+                <w:szCs w:val="20"/>
+                <w:lang w:val="en-US"/>
+              </w:rPr>
+              <w:t>pfSense</w:t>
+            </w:r>
+            <w:proofErr w:type="spellEnd"/>
+            <w:r>
+              <w:rPr>
+                <w:sz w:val="20"/>
+                <w:szCs w:val="20"/>
+                <w:lang w:val="en-US"/>
+              </w:rPr>
+              <w:t xml:space="preserve">, 3x Windows Server, 1x Ubuntu, 1x </w:t>
+            </w:r>
+            <w:proofErr w:type="spellStart"/>
+            <w:r>
+              <w:rPr>
+                <w:sz w:val="20"/>
+                <w:szCs w:val="20"/>
+                <w:lang w:val="en-US"/>
+              </w:rPr>
+              <w:t>FreePBX</w:t>
+            </w:r>
+            <w:proofErr w:type="spellEnd"/>
+            <w:r>
+              <w:rPr>
+                <w:sz w:val="20"/>
+                <w:szCs w:val="20"/>
+                <w:lang w:val="en-US"/>
+              </w:rPr>
+              <w:t>)</w:t>
             </w:r>
           </w:p>
         </w:tc>
@@ -26802,9 +28140,14 @@
       </w:pPr>
       <w:bookmarkStart w:id="58" w:name="_Toc222085265"/>
       <w:r>
-        <w:t>5.3 Test QoS VoIP</w:t>
+        <w:t xml:space="preserve">5.3 Test QoS </w:t>
+      </w:r>
+      <w:proofErr w:type="spellStart"/>
+      <w:r>
+        <w:t>VoIP</w:t>
       </w:r>
       <w:bookmarkEnd w:id="58"/>
+      <w:proofErr w:type="spellEnd"/>
     </w:p>
     <w:p>
       <w:pPr>
@@ -26818,7 +28161,15 @@
         <w:t xml:space="preserve">Objectif : </w:t>
       </w:r>
       <w:r>
-        <w:t>Vérifier que la VoIP reste stable sous charge réseau.</w:t>
+        <w:t xml:space="preserve">Vérifier que la </w:t>
+      </w:r>
+      <w:proofErr w:type="spellStart"/>
+      <w:r>
+        <w:t>VoIP</w:t>
+      </w:r>
+      <w:proofErr w:type="spellEnd"/>
+      <w:r>
+        <w:t xml:space="preserve"> reste stable sous charge réseau.</w:t>
       </w:r>
     </w:p>
     <w:p>
@@ -26826,7 +28177,39 @@
         <w:spacing w:after="120"/>
       </w:pPr>
       <w:r>
-        <w:t>QoS PRIQ configurée sur pfSense : qVoIP (priorité 7), qServers (priorité 5), qDefault (priorité 1). Saturation du LAN à 500 Mbits/sec via iperf3.</w:t>
+        <w:t xml:space="preserve">QoS PRIQ configurée sur </w:t>
+      </w:r>
+      <w:proofErr w:type="spellStart"/>
+      <w:r>
+        <w:t>pfSense</w:t>
+      </w:r>
+      <w:proofErr w:type="spellEnd"/>
+      <w:r>
+        <w:t xml:space="preserve"> : </w:t>
+      </w:r>
+      <w:proofErr w:type="spellStart"/>
+      <w:r>
+        <w:t>qVoIP</w:t>
+      </w:r>
+      <w:proofErr w:type="spellEnd"/>
+      <w:r>
+        <w:t xml:space="preserve"> (priorité 7), </w:t>
+      </w:r>
+      <w:proofErr w:type="spellStart"/>
+      <w:r>
+        <w:t>qServers</w:t>
+      </w:r>
+      <w:proofErr w:type="spellEnd"/>
+      <w:r>
+        <w:t xml:space="preserve"> (priorité 5), </w:t>
+      </w:r>
+      <w:proofErr w:type="spellStart"/>
+      <w:r>
+        <w:t>qDefault</w:t>
+      </w:r>
+      <w:proofErr w:type="spellEnd"/>
+      <w:r>
+        <w:t xml:space="preserve"> (priorité 1). Saturation du LAN à 500 Mbits/sec via iperf3.</w:t>
       </w:r>
     </w:p>
     <w:tbl>
@@ -27004,7 +28387,23 @@
                 <w:sz w:val="20"/>
                 <w:szCs w:val="20"/>
               </w:rPr>
-              <w:t>Latence (one-way)</w:t>
+              <w:t>Latence (one-</w:t>
+            </w:r>
+            <w:proofErr w:type="spellStart"/>
+            <w:r>
+              <w:rPr>
+                <w:sz w:val="20"/>
+                <w:szCs w:val="20"/>
+              </w:rPr>
+              <w:t>way</w:t>
+            </w:r>
+            <w:proofErr w:type="spellEnd"/>
+            <w:r>
+              <w:rPr>
+                <w:sz w:val="20"/>
+                <w:szCs w:val="20"/>
+              </w:rPr>
+              <w:t>)</w:t>
             </w:r>
           </w:p>
         </w:tc>
@@ -27110,6 +28509,7 @@
             </w:tcMar>
           </w:tcPr>
           <w:p>
+            <w:proofErr w:type="spellStart"/>
             <w:r>
               <w:rPr>
                 <w:sz w:val="20"/>
@@ -27117,6 +28517,7 @@
               </w:rPr>
               <w:t>Jitter</w:t>
             </w:r>
+            <w:proofErr w:type="spellEnd"/>
           </w:p>
         </w:tc>
         <w:tc>
@@ -28019,8 +29420,17 @@
                 <w:sz w:val="20"/>
                 <w:szCs w:val="20"/>
               </w:rPr>
-              <w:t>Réplication reprend, 0 failures</w:t>
-            </w:r>
+              <w:t xml:space="preserve">Réplication reprend, 0 </w:t>
+            </w:r>
+            <w:proofErr w:type="spellStart"/>
+            <w:r>
+              <w:rPr>
+                <w:sz w:val="20"/>
+                <w:szCs w:val="20"/>
+              </w:rPr>
+              <w:t>failures</w:t>
+            </w:r>
+            <w:proofErr w:type="spellEnd"/>
           </w:p>
         </w:tc>
         <w:tc>
@@ -28509,7 +29919,23 @@
                 <w:sz w:val="20"/>
                 <w:szCs w:val="20"/>
               </w:rPr>
-              <w:t>Arrêt brutal (qm stop)</w:t>
+              <w:t>Arrêt brutal (</w:t>
+            </w:r>
+            <w:proofErr w:type="spellStart"/>
+            <w:r>
+              <w:rPr>
+                <w:sz w:val="20"/>
+                <w:szCs w:val="20"/>
+              </w:rPr>
+              <w:t>qm</w:t>
+            </w:r>
+            <w:proofErr w:type="spellEnd"/>
+            <w:r>
+              <w:rPr>
+                <w:sz w:val="20"/>
+                <w:szCs w:val="20"/>
+              </w:rPr>
+              <w:t xml:space="preserve"> stop)</w:t>
             </w:r>
           </w:p>
         </w:tc>
@@ -28619,7 +30045,23 @@
                 <w:sz w:val="20"/>
                 <w:szCs w:val="20"/>
               </w:rPr>
-              <w:t>Redémarrage (qm start)</w:t>
+              <w:t>Redémarrage (</w:t>
+            </w:r>
+            <w:proofErr w:type="spellStart"/>
+            <w:r>
+              <w:rPr>
+                <w:sz w:val="20"/>
+                <w:szCs w:val="20"/>
+              </w:rPr>
+              <w:t>qm</w:t>
+            </w:r>
+            <w:proofErr w:type="spellEnd"/>
+            <w:r>
+              <w:rPr>
+                <w:sz w:val="20"/>
+                <w:szCs w:val="20"/>
+              </w:rPr>
+              <w:t xml:space="preserve"> start)</w:t>
             </w:r>
           </w:p>
         </w:tc>
@@ -29268,13 +30710,41 @@
                 <w:lang w:val="en-US"/>
               </w:rPr>
             </w:pPr>
+            <w:proofErr w:type="spellStart"/>
             <w:r>
               <w:rPr>
                 <w:sz w:val="20"/>
                 <w:szCs w:val="20"/>
                 <w:lang w:val="en-US"/>
               </w:rPr>
-              <w:t>nslookup dc-azure.lab.local → OK</w:t>
+              <w:t>nslookup</w:t>
+            </w:r>
+            <w:proofErr w:type="spellEnd"/>
+            <w:r>
+              <w:rPr>
+                <w:sz w:val="20"/>
+                <w:szCs w:val="20"/>
+                <w:lang w:val="en-US"/>
+              </w:rPr>
+              <w:t xml:space="preserve"> dc-</w:t>
+            </w:r>
+            <w:proofErr w:type="spellStart"/>
+            <w:r>
+              <w:rPr>
+                <w:sz w:val="20"/>
+                <w:szCs w:val="20"/>
+                <w:lang w:val="en-US"/>
+              </w:rPr>
+              <w:t>azure.lab.local</w:t>
+            </w:r>
+            <w:proofErr w:type="spellEnd"/>
+            <w:r>
+              <w:rPr>
+                <w:sz w:val="20"/>
+                <w:szCs w:val="20"/>
+                <w:lang w:val="en-US"/>
+              </w:rPr>
+              <w:t xml:space="preserve"> → OK</w:t>
             </w:r>
           </w:p>
         </w:tc>
@@ -29610,8 +31080,17 @@
                 <w:sz w:val="20"/>
                 <w:szCs w:val="20"/>
               </w:rPr>
-              <w:t>QoS VoIP</w:t>
-            </w:r>
+              <w:t xml:space="preserve">QoS </w:t>
+            </w:r>
+            <w:proofErr w:type="spellStart"/>
+            <w:r>
+              <w:rPr>
+                <w:sz w:val="20"/>
+                <w:szCs w:val="20"/>
+              </w:rPr>
+              <w:t>VoIP</w:t>
+            </w:r>
+            <w:proofErr w:type="spellEnd"/>
           </w:p>
         </w:tc>
         <w:tc>
@@ -29690,7 +31169,23 @@
                 <w:sz w:val="20"/>
                 <w:szCs w:val="20"/>
               </w:rPr>
-              <w:t>Latence 0.1ms, jitter 0.04ms, 0% perte sous 500Mbps</w:t>
+              <w:t xml:space="preserve">Latence 0.1ms, </w:t>
+            </w:r>
+            <w:proofErr w:type="spellStart"/>
+            <w:r>
+              <w:rPr>
+                <w:sz w:val="20"/>
+                <w:szCs w:val="20"/>
+              </w:rPr>
+              <w:t>jitter</w:t>
+            </w:r>
+            <w:proofErr w:type="spellEnd"/>
+            <w:r>
+              <w:rPr>
+                <w:sz w:val="20"/>
+                <w:szCs w:val="20"/>
+              </w:rPr>
+              <w:t xml:space="preserve"> 0.04ms, 0% perte sous 500Mbps</w:t>
             </w:r>
           </w:p>
         </w:tc>
@@ -29802,7 +31297,23 @@
                 <w:sz w:val="20"/>
                 <w:szCs w:val="20"/>
               </w:rPr>
-              <w:t>Bascule immédiate, DNS + auth OK</w:t>
+              <w:t xml:space="preserve">Bascule immédiate, DNS + </w:t>
+            </w:r>
+            <w:proofErr w:type="spellStart"/>
+            <w:r>
+              <w:rPr>
+                <w:sz w:val="20"/>
+                <w:szCs w:val="20"/>
+              </w:rPr>
+              <w:t>auth</w:t>
+            </w:r>
+            <w:proofErr w:type="spellEnd"/>
+            <w:r>
+              <w:rPr>
+                <w:sz w:val="20"/>
+                <w:szCs w:val="20"/>
+              </w:rPr>
+              <w:t xml:space="preserve"> OK</w:t>
             </w:r>
           </w:p>
         </w:tc>
@@ -29916,8 +31427,18 @@
                 <w:szCs w:val="20"/>
                 <w:lang w:val="en-US"/>
               </w:rPr>
-              <w:t>VM reboot ~20s, 5/5 records intacts</w:t>
-            </w:r>
+              <w:t xml:space="preserve">VM reboot ~20s, 5/5 records </w:t>
+            </w:r>
+            <w:proofErr w:type="spellStart"/>
+            <w:r>
+              <w:rPr>
+                <w:sz w:val="20"/>
+                <w:szCs w:val="20"/>
+                <w:lang w:val="en-US"/>
+              </w:rPr>
+              <w:t>intacts</w:t>
+            </w:r>
+            <w:proofErr w:type="spellEnd"/>
           </w:p>
         </w:tc>
       </w:tr>
@@ -30034,7 +31555,25 @@
                 <w:szCs w:val="20"/>
                 <w:lang w:val="en-US"/>
               </w:rPr>
-              <w:t>Ping + DNS + réplication AD cross-site OK</w:t>
+              <w:t xml:space="preserve">Ping + DNS + </w:t>
+            </w:r>
+            <w:proofErr w:type="spellStart"/>
+            <w:r>
+              <w:rPr>
+                <w:sz w:val="20"/>
+                <w:szCs w:val="20"/>
+                <w:lang w:val="en-US"/>
+              </w:rPr>
+              <w:t>réplication</w:t>
+            </w:r>
+            <w:proofErr w:type="spellEnd"/>
+            <w:r>
+              <w:rPr>
+                <w:sz w:val="20"/>
+                <w:szCs w:val="20"/>
+                <w:lang w:val="en-US"/>
+              </w:rPr>
+              <w:t xml:space="preserve"> AD cross-site OK</w:t>
             </w:r>
           </w:p>
         </w:tc>
@@ -30064,7 +31603,51 @@
           <w:sz w:val="21"/>
           <w:szCs w:val="21"/>
         </w:rPr>
-        <w:t>Conclusion : les 4 tests valident que l’architecture cible répond aux exigences de haute disponibilité, de qualité de service VoIP et de connectivité multi-sites.</w:t>
+        <w:t xml:space="preserve">Conclusion : les 4 tests valident que l’architecture cible répond aux exigences de haute disponibilité, de qualité de service </w:t>
+      </w:r>
+      <w:proofErr w:type="spellStart"/>
+      <w:r>
+        <w:rPr>
+          <w:i/>
+          <w:iCs/>
+          <w:color w:val="555555"/>
+          <w:sz w:val="21"/>
+          <w:szCs w:val="21"/>
+        </w:rPr>
+        <w:t>VoIP</w:t>
+      </w:r>
+      <w:proofErr w:type="spellEnd"/>
+      <w:r>
+        <w:rPr>
+          <w:i/>
+          <w:iCs/>
+          <w:color w:val="555555"/>
+          <w:sz w:val="21"/>
+          <w:szCs w:val="21"/>
+        </w:rPr>
+        <w:t xml:space="preserve"> et de connectivité </w:t>
+      </w:r>
+      <w:proofErr w:type="spellStart"/>
+      <w:r>
+        <w:rPr>
+          <w:i/>
+          <w:iCs/>
+          <w:color w:val="555555"/>
+          <w:sz w:val="21"/>
+          <w:szCs w:val="21"/>
+        </w:rPr>
+        <w:t>multi-sites</w:t>
+      </w:r>
+      <w:proofErr w:type="spellEnd"/>
+      <w:r>
+        <w:rPr>
+          <w:i/>
+          <w:iCs/>
+          <w:color w:val="555555"/>
+          <w:sz w:val="21"/>
+          <w:szCs w:val="21"/>
+        </w:rPr>
+        <w:t>.</w:t>
       </w:r>
     </w:p>
     <w:p/>
@@ -30316,12 +31899,21 @@
             </w:tcMar>
           </w:tcPr>
           <w:p>
-            <w:r>
-              <w:rPr>
-                <w:sz w:val="20"/>
-                <w:szCs w:val="20"/>
-              </w:rPr>
-              <w:t>FortiGate 100F</w:t>
+            <w:proofErr w:type="spellStart"/>
+            <w:r>
+              <w:rPr>
+                <w:sz w:val="20"/>
+                <w:szCs w:val="20"/>
+              </w:rPr>
+              <w:t>FortiGate</w:t>
+            </w:r>
+            <w:proofErr w:type="spellEnd"/>
+            <w:r>
+              <w:rPr>
+                <w:sz w:val="20"/>
+                <w:szCs w:val="20"/>
+              </w:rPr>
+              <w:t xml:space="preserve"> 100F</w:t>
             </w:r>
           </w:p>
         </w:tc>
@@ -30450,12 +32042,21 @@
             </w:tcMar>
           </w:tcPr>
           <w:p>
-            <w:r>
-              <w:rPr>
-                <w:sz w:val="20"/>
-                <w:szCs w:val="20"/>
-              </w:rPr>
-              <w:t>FortiGate 60F</w:t>
+            <w:proofErr w:type="spellStart"/>
+            <w:r>
+              <w:rPr>
+                <w:sz w:val="20"/>
+                <w:szCs w:val="20"/>
+              </w:rPr>
+              <w:t>FortiGate</w:t>
+            </w:r>
+            <w:proofErr w:type="spellEnd"/>
+            <w:r>
+              <w:rPr>
+                <w:sz w:val="20"/>
+                <w:szCs w:val="20"/>
+              </w:rPr>
+              <w:t xml:space="preserve"> 60F</w:t>
             </w:r>
           </w:p>
         </w:tc>
@@ -30536,7 +32137,23 @@
                 <w:sz w:val="20"/>
                 <w:szCs w:val="20"/>
               </w:rPr>
-              <w:t>VPN spoke, QoS</w:t>
+              <w:t xml:space="preserve">VPN </w:t>
+            </w:r>
+            <w:proofErr w:type="spellStart"/>
+            <w:r>
+              <w:rPr>
+                <w:sz w:val="20"/>
+                <w:szCs w:val="20"/>
+              </w:rPr>
+              <w:t>spoke</w:t>
+            </w:r>
+            <w:proofErr w:type="spellEnd"/>
+            <w:r>
+              <w:rPr>
+                <w:sz w:val="20"/>
+                <w:szCs w:val="20"/>
+              </w:rPr>
+              <w:t>, QoS</w:t>
             </w:r>
           </w:p>
         </w:tc>
@@ -30585,12 +32202,21 @@
             </w:tcMar>
           </w:tcPr>
           <w:p>
-            <w:r>
-              <w:rPr>
-                <w:sz w:val="20"/>
-                <w:szCs w:val="20"/>
-              </w:rPr>
-              <w:t>FortiGate 40F</w:t>
+            <w:proofErr w:type="spellStart"/>
+            <w:r>
+              <w:rPr>
+                <w:sz w:val="20"/>
+                <w:szCs w:val="20"/>
+              </w:rPr>
+              <w:t>FortiGate</w:t>
+            </w:r>
+            <w:proofErr w:type="spellEnd"/>
+            <w:r>
+              <w:rPr>
+                <w:sz w:val="20"/>
+                <w:szCs w:val="20"/>
+              </w:rPr>
+              <w:t xml:space="preserve"> 40F</w:t>
             </w:r>
           </w:p>
         </w:tc>
@@ -30854,12 +32480,21 @@
             </w:tcMar>
           </w:tcPr>
           <w:p>
-            <w:r>
-              <w:rPr>
-                <w:sz w:val="20"/>
-                <w:szCs w:val="20"/>
-              </w:rPr>
-              <w:t>PowerVault ME5012</w:t>
+            <w:proofErr w:type="spellStart"/>
+            <w:r>
+              <w:rPr>
+                <w:sz w:val="20"/>
+                <w:szCs w:val="20"/>
+              </w:rPr>
+              <w:t>PowerVault</w:t>
+            </w:r>
+            <w:proofErr w:type="spellEnd"/>
+            <w:r>
+              <w:rPr>
+                <w:sz w:val="20"/>
+                <w:szCs w:val="20"/>
+              </w:rPr>
+              <w:t xml:space="preserve"> ME5012</w:t>
             </w:r>
           </w:p>
         </w:tc>
@@ -32345,8 +33980,17 @@
                 <w:sz w:val="20"/>
                 <w:szCs w:val="20"/>
               </w:rPr>
-              <w:t>Réplication Site Recovery</w:t>
-            </w:r>
+              <w:t xml:space="preserve">Réplication Site </w:t>
+            </w:r>
+            <w:proofErr w:type="spellStart"/>
+            <w:r>
+              <w:rPr>
+                <w:sz w:val="20"/>
+                <w:szCs w:val="20"/>
+              </w:rPr>
+              <w:t>Recovery</w:t>
+            </w:r>
+            <w:proofErr w:type="spellEnd"/>
           </w:p>
         </w:tc>
       </w:tr>
@@ -32608,12 +34252,21 @@
             </w:tcMar>
           </w:tcPr>
           <w:p>
-            <w:r>
-              <w:rPr>
-                <w:sz w:val="20"/>
-                <w:szCs w:val="20"/>
-              </w:rPr>
-              <w:t>Recovery Time Objective – durée maximale d’indisponibilité acceptable</w:t>
+            <w:proofErr w:type="spellStart"/>
+            <w:r>
+              <w:rPr>
+                <w:sz w:val="20"/>
+                <w:szCs w:val="20"/>
+              </w:rPr>
+              <w:t>Recovery</w:t>
+            </w:r>
+            <w:proofErr w:type="spellEnd"/>
+            <w:r>
+              <w:rPr>
+                <w:sz w:val="20"/>
+                <w:szCs w:val="20"/>
+              </w:rPr>
+              <w:t xml:space="preserve"> Time Objective – durée maximale d’indisponibilité acceptable</w:t>
             </w:r>
           </w:p>
         </w:tc>
@@ -32664,12 +34317,21 @@
             </w:tcMar>
           </w:tcPr>
           <w:p>
-            <w:r>
-              <w:rPr>
-                <w:sz w:val="20"/>
-                <w:szCs w:val="20"/>
-              </w:rPr>
-              <w:t>Recovery Point Objective – perte de données maximale acceptable</w:t>
+            <w:proofErr w:type="spellStart"/>
+            <w:r>
+              <w:rPr>
+                <w:sz w:val="20"/>
+                <w:szCs w:val="20"/>
+              </w:rPr>
+              <w:t>Recovery</w:t>
+            </w:r>
+            <w:proofErr w:type="spellEnd"/>
+            <w:r>
+              <w:rPr>
+                <w:sz w:val="20"/>
+                <w:szCs w:val="20"/>
+              </w:rPr>
+              <w:t xml:space="preserve"> Point Objective – perte de données maximale acceptable</w:t>
             </w:r>
           </w:p>
         </w:tc>
@@ -32718,12 +34380,21 @@
             </w:tcMar>
           </w:tcPr>
           <w:p>
-            <w:r>
-              <w:rPr>
-                <w:sz w:val="20"/>
-                <w:szCs w:val="20"/>
-              </w:rPr>
-              <w:t>Differentiated Services Code Point – marquage QoS des paquets IP</w:t>
+            <w:proofErr w:type="spellStart"/>
+            <w:r>
+              <w:rPr>
+                <w:sz w:val="20"/>
+                <w:szCs w:val="20"/>
+              </w:rPr>
+              <w:t>Differentiated</w:t>
+            </w:r>
+            <w:proofErr w:type="spellEnd"/>
+            <w:r>
+              <w:rPr>
+                <w:sz w:val="20"/>
+                <w:szCs w:val="20"/>
+              </w:rPr>
+              <w:t xml:space="preserve"> Services Code Point – marquage QoS des paquets IP</w:t>
             </w:r>
           </w:p>
         </w:tc>
@@ -32774,12 +34445,21 @@
             </w:tcMar>
           </w:tcPr>
           <w:p>
-            <w:r>
-              <w:rPr>
-                <w:sz w:val="20"/>
-                <w:szCs w:val="20"/>
-              </w:rPr>
-              <w:t>Unified Threat Management – pare-feu avec fonctions de sécurité intégrées</w:t>
+            <w:proofErr w:type="spellStart"/>
+            <w:r>
+              <w:rPr>
+                <w:sz w:val="20"/>
+                <w:szCs w:val="20"/>
+              </w:rPr>
+              <w:t>Unified</w:t>
+            </w:r>
+            <w:proofErr w:type="spellEnd"/>
+            <w:r>
+              <w:rPr>
+                <w:sz w:val="20"/>
+                <w:szCs w:val="20"/>
+              </w:rPr>
+              <w:t xml:space="preserve"> Threat Management – pare-feu avec fonctions de sécurité intégrées</w:t>
             </w:r>
           </w:p>
         </w:tc>
@@ -32834,7 +34514,23 @@
                 <w:sz w:val="20"/>
                 <w:szCs w:val="20"/>
               </w:rPr>
-              <w:t>Internet Small Computer Systems Interface – protocole de stockage en réseau</w:t>
+              <w:t xml:space="preserve">Internet Small Computer </w:t>
+            </w:r>
+            <w:proofErr w:type="spellStart"/>
+            <w:r>
+              <w:rPr>
+                <w:sz w:val="20"/>
+                <w:szCs w:val="20"/>
+              </w:rPr>
+              <w:t>Systems</w:t>
+            </w:r>
+            <w:proofErr w:type="spellEnd"/>
+            <w:r>
+              <w:rPr>
+                <w:sz w:val="20"/>
+                <w:szCs w:val="20"/>
+              </w:rPr>
+              <w:t xml:space="preserve"> Interface – protocole de stockage en réseau</w:t>
             </w:r>
           </w:p>
         </w:tc>
@@ -32890,7 +34586,23 @@
                 <w:sz w:val="20"/>
                 <w:szCs w:val="20"/>
               </w:rPr>
-              <w:t>Dead Peer Detection – détection de perte de tunnel VPN</w:t>
+              <w:t xml:space="preserve">Dead Peer </w:t>
+            </w:r>
+            <w:proofErr w:type="spellStart"/>
+            <w:r>
+              <w:rPr>
+                <w:sz w:val="20"/>
+                <w:szCs w:val="20"/>
+              </w:rPr>
+              <w:t>Detection</w:t>
+            </w:r>
+            <w:proofErr w:type="spellEnd"/>
+            <w:r>
+              <w:rPr>
+                <w:sz w:val="20"/>
+                <w:szCs w:val="20"/>
+              </w:rPr>
+              <w:t xml:space="preserve"> – détection de perte de tunnel VPN</w:t>
             </w:r>
           </w:p>
         </w:tc>
@@ -33039,8 +34751,42 @@
         <w:szCs w:val="18"/>
       </w:rPr>
       <w:tab/>
-      <w:t>MSPR – NordTransit Logistics</w:t>
+      <w:t xml:space="preserve">MSPR – </w:t>
     </w:r>
+    <w:proofErr w:type="spellStart"/>
+    <w:r>
+      <w:rPr>
+        <w:i/>
+        <w:iCs/>
+        <w:color w:val="888888"/>
+        <w:sz w:val="18"/>
+        <w:szCs w:val="18"/>
+      </w:rPr>
+      <w:t>NordTransit</w:t>
+    </w:r>
+    <w:proofErr w:type="spellEnd"/>
+    <w:r>
+      <w:rPr>
+        <w:i/>
+        <w:iCs/>
+        <w:color w:val="888888"/>
+        <w:sz w:val="18"/>
+        <w:szCs w:val="18"/>
+      </w:rPr>
+      <w:t xml:space="preserve"> </w:t>
+    </w:r>
+    <w:proofErr w:type="spellStart"/>
+    <w:r>
+      <w:rPr>
+        <w:i/>
+        <w:iCs/>
+        <w:color w:val="888888"/>
+        <w:sz w:val="18"/>
+        <w:szCs w:val="18"/>
+      </w:rPr>
+      <w:t>Logistics</w:t>
+    </w:r>
+    <w:proofErr w:type="spellEnd"/>
   </w:p>
 </w:hdr>
 </file>
@@ -33754,6 +35500,7 @@
   <w:style w:type="character" w:default="1" w:styleId="DefaultParagraphFont">
     <w:name w:val="Default Paragraph Font"/>
     <w:uiPriority w:val="1"/>
+    <w:semiHidden/>
     <w:unhideWhenUsed/>
   </w:style>
   <w:style w:type="table" w:default="1" w:styleId="TableNormal">

</xml_diff>